<commit_message>
Added new tailwid files
</commit_message>
<xml_diff>
--- a/tailwind-notes.docx
+++ b/tailwind-notes.docx
@@ -11203,6 +11203,2942 @@
     </w:p>
     <w:p>
       <w:pPr>
+        <w:rPr>
+          <w:sz w:val="28"/>
+          <w:szCs w:val="28"/>
+        </w:rPr>
+      </w:pPr>
+    </w:p>
+    <w:p>
+      <w:pPr>
+        <w:rPr>
+          <w:sz w:val="28"/>
+          <w:szCs w:val="28"/>
+        </w:rPr>
+      </w:pPr>
+    </w:p>
+    <w:p>
+      <w:pPr>
+        <w:rPr>
+          <w:b/>
+          <w:bCs/>
+          <w:sz w:val="28"/>
+          <w:szCs w:val="28"/>
+        </w:rPr>
+      </w:pPr>
+      <w:r>
+        <w:rPr>
+          <w:rFonts w:ascii="Segoe UI Emoji" w:hAnsi="Segoe UI Emoji" w:cs="Segoe UI Emoji"/>
+          <w:b/>
+          <w:bCs/>
+          <w:sz w:val="28"/>
+          <w:szCs w:val="28"/>
+        </w:rPr>
+        <w:t>🧭</w:t>
+      </w:r>
+      <w:r>
+        <w:rPr>
+          <w:b/>
+          <w:bCs/>
+          <w:sz w:val="28"/>
+          <w:szCs w:val="28"/>
+        </w:rPr>
+        <w:t xml:space="preserve"> ROADMAP TO MASTER RESPONSIVENESS IN TAILWIND CSS</w:t>
+      </w:r>
+    </w:p>
+    <w:p>
+      <w:pPr>
+        <w:rPr>
+          <w:sz w:val="28"/>
+          <w:szCs w:val="28"/>
+        </w:rPr>
+      </w:pPr>
+      <w:r>
+        <w:rPr>
+          <w:sz w:val="28"/>
+          <w:szCs w:val="28"/>
+        </w:rPr>
+        <w:t>Here’s how we’ll go:</w:t>
+      </w:r>
+    </w:p>
+    <w:p>
+      <w:pPr>
+        <w:numPr>
+          <w:ilvl w:val="0"/>
+          <w:numId w:val="31"/>
+        </w:numPr>
+        <w:rPr>
+          <w:sz w:val="28"/>
+          <w:szCs w:val="28"/>
+        </w:rPr>
+      </w:pPr>
+      <w:r>
+        <w:rPr>
+          <w:b/>
+          <w:bCs/>
+          <w:sz w:val="28"/>
+          <w:szCs w:val="28"/>
+        </w:rPr>
+        <w:t>Basics of Tailwind &amp; Responsive Prefixes</w:t>
+      </w:r>
+    </w:p>
+    <w:p>
+      <w:pPr>
+        <w:numPr>
+          <w:ilvl w:val="0"/>
+          <w:numId w:val="31"/>
+        </w:numPr>
+        <w:rPr>
+          <w:sz w:val="28"/>
+          <w:szCs w:val="28"/>
+        </w:rPr>
+      </w:pPr>
+      <w:r>
+        <w:rPr>
+          <w:b/>
+          <w:bCs/>
+          <w:sz w:val="28"/>
+          <w:szCs w:val="28"/>
+        </w:rPr>
+        <w:t>Breakpoints &amp; Their Meaning</w:t>
+      </w:r>
+    </w:p>
+    <w:p>
+      <w:pPr>
+        <w:numPr>
+          <w:ilvl w:val="0"/>
+          <w:numId w:val="31"/>
+        </w:numPr>
+        <w:rPr>
+          <w:sz w:val="28"/>
+          <w:szCs w:val="28"/>
+        </w:rPr>
+      </w:pPr>
+      <w:r>
+        <w:rPr>
+          <w:b/>
+          <w:bCs/>
+          <w:sz w:val="28"/>
+          <w:szCs w:val="28"/>
+        </w:rPr>
+        <w:t>Common Responsive Patterns (flex, grid, spacing, text sizes)</w:t>
+      </w:r>
+    </w:p>
+    <w:p>
+      <w:pPr>
+        <w:numPr>
+          <w:ilvl w:val="0"/>
+          <w:numId w:val="31"/>
+        </w:numPr>
+        <w:rPr>
+          <w:sz w:val="28"/>
+          <w:szCs w:val="28"/>
+        </w:rPr>
+      </w:pPr>
+      <w:r>
+        <w:rPr>
+          <w:b/>
+          <w:bCs/>
+          <w:sz w:val="28"/>
+          <w:szCs w:val="28"/>
+        </w:rPr>
+        <w:t>Practical Layout Examples (2-</w:t>
+      </w:r>
+      <w:proofErr w:type="gramStart"/>
+      <w:r>
+        <w:rPr>
+          <w:b/>
+          <w:bCs/>
+          <w:sz w:val="28"/>
+          <w:szCs w:val="28"/>
+        </w:rPr>
+        <w:t>cols</w:t>
+      </w:r>
+      <w:proofErr w:type="gramEnd"/>
+      <w:r>
+        <w:rPr>
+          <w:b/>
+          <w:bCs/>
+          <w:sz w:val="28"/>
+          <w:szCs w:val="28"/>
+        </w:rPr>
+        <w:t>, navbar, cards, etc.)</w:t>
+      </w:r>
+    </w:p>
+    <w:p>
+      <w:pPr>
+        <w:numPr>
+          <w:ilvl w:val="0"/>
+          <w:numId w:val="31"/>
+        </w:numPr>
+        <w:rPr>
+          <w:sz w:val="28"/>
+          <w:szCs w:val="28"/>
+        </w:rPr>
+      </w:pPr>
+      <w:r>
+        <w:rPr>
+          <w:b/>
+          <w:bCs/>
+          <w:sz w:val="28"/>
+          <w:szCs w:val="28"/>
+        </w:rPr>
+        <w:t>Responsive Images &amp; Hiding Elements</w:t>
+      </w:r>
+    </w:p>
+    <w:p>
+      <w:pPr>
+        <w:numPr>
+          <w:ilvl w:val="0"/>
+          <w:numId w:val="31"/>
+        </w:numPr>
+        <w:rPr>
+          <w:sz w:val="28"/>
+          <w:szCs w:val="28"/>
+        </w:rPr>
+      </w:pPr>
+      <w:r>
+        <w:rPr>
+          <w:b/>
+          <w:bCs/>
+          <w:sz w:val="28"/>
+          <w:szCs w:val="28"/>
+        </w:rPr>
+        <w:t>Advanced Tricks (container, custom breakpoints, dark mode)</w:t>
+      </w:r>
+    </w:p>
+    <w:p>
+      <w:pPr>
+        <w:rPr>
+          <w:sz w:val="28"/>
+          <w:szCs w:val="28"/>
+        </w:rPr>
+      </w:pPr>
+      <w:r>
+        <w:rPr>
+          <w:sz w:val="28"/>
+          <w:szCs w:val="28"/>
+        </w:rPr>
+        <w:pict w14:anchorId="427D7A12">
+          <v:rect id="_x0000_i1074" style="width:0;height:1.5pt" o:hralign="center" o:hrstd="t" o:hr="t" fillcolor="#a0a0a0" stroked="f"/>
+        </w:pict>
+      </w:r>
+    </w:p>
+    <w:p>
+      <w:pPr>
+        <w:rPr>
+          <w:b/>
+          <w:bCs/>
+          <w:sz w:val="28"/>
+          <w:szCs w:val="28"/>
+        </w:rPr>
+      </w:pPr>
+      <w:r>
+        <w:rPr>
+          <w:rFonts w:ascii="Segoe UI Emoji" w:hAnsi="Segoe UI Emoji" w:cs="Segoe UI Emoji"/>
+          <w:b/>
+          <w:bCs/>
+          <w:sz w:val="28"/>
+          <w:szCs w:val="28"/>
+        </w:rPr>
+        <w:t>🪄</w:t>
+      </w:r>
+      <w:r>
+        <w:rPr>
+          <w:b/>
+          <w:bCs/>
+          <w:sz w:val="28"/>
+          <w:szCs w:val="28"/>
+        </w:rPr>
+        <w:t xml:space="preserve"> STEP 1: Understanding Tailwind’s Responsive Philosophy</w:t>
+      </w:r>
+    </w:p>
+    <w:p>
+      <w:pPr>
+        <w:rPr>
+          <w:sz w:val="28"/>
+          <w:szCs w:val="28"/>
+        </w:rPr>
+      </w:pPr>
+      <w:r>
+        <w:rPr>
+          <w:sz w:val="28"/>
+          <w:szCs w:val="28"/>
+        </w:rPr>
+        <w:t xml:space="preserve">In Tailwind, </w:t>
+      </w:r>
+      <w:r>
+        <w:rPr>
+          <w:b/>
+          <w:bCs/>
+          <w:sz w:val="28"/>
+          <w:szCs w:val="28"/>
+        </w:rPr>
+        <w:t>mobile-first</w:t>
+      </w:r>
+      <w:r>
+        <w:rPr>
+          <w:sz w:val="28"/>
+          <w:szCs w:val="28"/>
+        </w:rPr>
+        <w:t xml:space="preserve"> design is default.</w:t>
+      </w:r>
+    </w:p>
+    <w:p>
+      <w:pPr>
+        <w:rPr>
+          <w:sz w:val="28"/>
+          <w:szCs w:val="28"/>
+        </w:rPr>
+      </w:pPr>
+      <w:r>
+        <w:rPr>
+          <w:rFonts w:ascii="Segoe UI Emoji" w:hAnsi="Segoe UI Emoji" w:cs="Segoe UI Emoji"/>
+          <w:sz w:val="28"/>
+          <w:szCs w:val="28"/>
+        </w:rPr>
+        <w:lastRenderedPageBreak/>
+        <w:t>👉</w:t>
+      </w:r>
+      <w:r>
+        <w:rPr>
+          <w:sz w:val="28"/>
+          <w:szCs w:val="28"/>
+        </w:rPr>
+        <w:t xml:space="preserve"> It means:</w:t>
+      </w:r>
+    </w:p>
+    <w:p>
+      <w:pPr>
+        <w:numPr>
+          <w:ilvl w:val="0"/>
+          <w:numId w:val="32"/>
+        </w:numPr>
+        <w:rPr>
+          <w:sz w:val="28"/>
+          <w:szCs w:val="28"/>
+        </w:rPr>
+      </w:pPr>
+      <w:r>
+        <w:rPr>
+          <w:sz w:val="28"/>
+          <w:szCs w:val="28"/>
+        </w:rPr>
+        <w:t xml:space="preserve">You design for </w:t>
+      </w:r>
+      <w:r>
+        <w:rPr>
+          <w:b/>
+          <w:bCs/>
+          <w:sz w:val="28"/>
+          <w:szCs w:val="28"/>
+        </w:rPr>
+        <w:t>mobile (smallest)</w:t>
+      </w:r>
+      <w:r>
+        <w:rPr>
+          <w:sz w:val="28"/>
+          <w:szCs w:val="28"/>
+        </w:rPr>
+        <w:t xml:space="preserve"> screens first (default classes).</w:t>
+      </w:r>
+    </w:p>
+    <w:p>
+      <w:pPr>
+        <w:numPr>
+          <w:ilvl w:val="0"/>
+          <w:numId w:val="32"/>
+        </w:numPr>
+        <w:rPr>
+          <w:sz w:val="28"/>
+          <w:szCs w:val="28"/>
+        </w:rPr>
+      </w:pPr>
+      <w:r>
+        <w:rPr>
+          <w:sz w:val="28"/>
+          <w:szCs w:val="28"/>
+        </w:rPr>
+        <w:t xml:space="preserve">Then add prefixes like </w:t>
+      </w:r>
+      <w:proofErr w:type="spellStart"/>
+      <w:proofErr w:type="gramStart"/>
+      <w:r>
+        <w:rPr>
+          <w:sz w:val="28"/>
+          <w:szCs w:val="28"/>
+        </w:rPr>
+        <w:t>sm</w:t>
+      </w:r>
+      <w:proofErr w:type="spellEnd"/>
+      <w:r>
+        <w:rPr>
+          <w:sz w:val="28"/>
+          <w:szCs w:val="28"/>
+        </w:rPr>
+        <w:t>:,</w:t>
+      </w:r>
+      <w:proofErr w:type="gramEnd"/>
+      <w:r>
+        <w:rPr>
+          <w:sz w:val="28"/>
+          <w:szCs w:val="28"/>
+        </w:rPr>
+        <w:t xml:space="preserve"> </w:t>
+      </w:r>
+      <w:proofErr w:type="gramStart"/>
+      <w:r>
+        <w:rPr>
+          <w:sz w:val="28"/>
+          <w:szCs w:val="28"/>
+        </w:rPr>
+        <w:t>md:,</w:t>
+      </w:r>
+      <w:proofErr w:type="gramEnd"/>
+      <w:r>
+        <w:rPr>
+          <w:sz w:val="28"/>
+          <w:szCs w:val="28"/>
+        </w:rPr>
+        <w:t xml:space="preserve"> </w:t>
+      </w:r>
+      <w:proofErr w:type="gramStart"/>
+      <w:r>
+        <w:rPr>
+          <w:sz w:val="28"/>
+          <w:szCs w:val="28"/>
+        </w:rPr>
+        <w:t>lg:,</w:t>
+      </w:r>
+      <w:proofErr w:type="gramEnd"/>
+      <w:r>
+        <w:rPr>
+          <w:sz w:val="28"/>
+          <w:szCs w:val="28"/>
+        </w:rPr>
+        <w:t xml:space="preserve"> xl: to change style </w:t>
+      </w:r>
+      <w:r>
+        <w:rPr>
+          <w:b/>
+          <w:bCs/>
+          <w:sz w:val="28"/>
+          <w:szCs w:val="28"/>
+        </w:rPr>
+        <w:t>as screen gets bigger</w:t>
+      </w:r>
+      <w:r>
+        <w:rPr>
+          <w:sz w:val="28"/>
+          <w:szCs w:val="28"/>
+        </w:rPr>
+        <w:t>.</w:t>
+      </w:r>
+    </w:p>
+    <w:p>
+      <w:pPr>
+        <w:rPr>
+          <w:b/>
+          <w:bCs/>
+          <w:sz w:val="28"/>
+          <w:szCs w:val="28"/>
+        </w:rPr>
+      </w:pPr>
+      <w:r>
+        <w:rPr>
+          <w:rFonts w:ascii="Segoe UI Emoji" w:hAnsi="Segoe UI Emoji" w:cs="Segoe UI Emoji"/>
+          <w:b/>
+          <w:bCs/>
+          <w:sz w:val="28"/>
+          <w:szCs w:val="28"/>
+        </w:rPr>
+        <w:t>🧩</w:t>
+      </w:r>
+      <w:r>
+        <w:rPr>
+          <w:b/>
+          <w:bCs/>
+          <w:sz w:val="28"/>
+          <w:szCs w:val="28"/>
+        </w:rPr>
+        <w:t xml:space="preserve"> Example 1 — Text Size Changes on Larger Screens</w:t>
+      </w:r>
+    </w:p>
+    <w:p>
+      <w:pPr>
+        <w:rPr>
+          <w:sz w:val="28"/>
+          <w:szCs w:val="28"/>
+        </w:rPr>
+      </w:pPr>
+      <w:r>
+        <w:rPr>
+          <w:sz w:val="28"/>
+          <w:szCs w:val="28"/>
+        </w:rPr>
+        <w:t>&lt;p class="text-</w:t>
+      </w:r>
+      <w:proofErr w:type="spellStart"/>
+      <w:r>
+        <w:rPr>
+          <w:sz w:val="28"/>
+          <w:szCs w:val="28"/>
+        </w:rPr>
+        <w:t>sm</w:t>
+      </w:r>
+      <w:proofErr w:type="spellEnd"/>
+      <w:r>
+        <w:rPr>
+          <w:sz w:val="28"/>
+          <w:szCs w:val="28"/>
+        </w:rPr>
+        <w:t xml:space="preserve"> </w:t>
+      </w:r>
+      <w:proofErr w:type="spellStart"/>
+      <w:r>
+        <w:rPr>
+          <w:sz w:val="28"/>
+          <w:szCs w:val="28"/>
+        </w:rPr>
+        <w:t>sm:text-base</w:t>
+      </w:r>
+      <w:proofErr w:type="spellEnd"/>
+      <w:r>
+        <w:rPr>
+          <w:sz w:val="28"/>
+          <w:szCs w:val="28"/>
+        </w:rPr>
+        <w:t xml:space="preserve"> </w:t>
+      </w:r>
+      <w:proofErr w:type="spellStart"/>
+      <w:r>
+        <w:rPr>
+          <w:sz w:val="28"/>
+          <w:szCs w:val="28"/>
+        </w:rPr>
+        <w:t>md:text-lg</w:t>
+      </w:r>
+      <w:proofErr w:type="spellEnd"/>
+      <w:r>
+        <w:rPr>
+          <w:sz w:val="28"/>
+          <w:szCs w:val="28"/>
+        </w:rPr>
+        <w:t xml:space="preserve"> </w:t>
+      </w:r>
+      <w:proofErr w:type="spellStart"/>
+      <w:r>
+        <w:rPr>
+          <w:sz w:val="28"/>
+          <w:szCs w:val="28"/>
+        </w:rPr>
+        <w:t>lg:text-xl</w:t>
+      </w:r>
+      <w:proofErr w:type="spellEnd"/>
+      <w:r>
+        <w:rPr>
+          <w:sz w:val="28"/>
+          <w:szCs w:val="28"/>
+        </w:rPr>
+        <w:t xml:space="preserve"> xl:text-2xl"&gt;</w:t>
+      </w:r>
+    </w:p>
+    <w:p>
+      <w:pPr>
+        <w:rPr>
+          <w:sz w:val="28"/>
+          <w:szCs w:val="28"/>
+        </w:rPr>
+      </w:pPr>
+      <w:r>
+        <w:rPr>
+          <w:sz w:val="28"/>
+          <w:szCs w:val="28"/>
+        </w:rPr>
+        <w:t xml:space="preserve">  </w:t>
+      </w:r>
+      <w:proofErr w:type="gramStart"/>
+      <w:r>
+        <w:rPr>
+          <w:sz w:val="28"/>
+          <w:szCs w:val="28"/>
+        </w:rPr>
+        <w:t>Hello Responsive World</w:t>
+      </w:r>
+      <w:proofErr w:type="gramEnd"/>
+      <w:r>
+        <w:rPr>
+          <w:sz w:val="28"/>
+          <w:szCs w:val="28"/>
+        </w:rPr>
+        <w:t xml:space="preserve"> </w:t>
+      </w:r>
+      <w:r>
+        <w:rPr>
+          <w:rFonts w:ascii="Segoe UI Emoji" w:hAnsi="Segoe UI Emoji" w:cs="Segoe UI Emoji"/>
+          <w:sz w:val="28"/>
+          <w:szCs w:val="28"/>
+        </w:rPr>
+        <w:t>🌎</w:t>
+      </w:r>
+    </w:p>
+    <w:p>
+      <w:pPr>
+        <w:rPr>
+          <w:sz w:val="28"/>
+          <w:szCs w:val="28"/>
+        </w:rPr>
+      </w:pPr>
+      <w:r>
+        <w:rPr>
+          <w:sz w:val="28"/>
+          <w:szCs w:val="28"/>
+        </w:rPr>
+        <w:t>&lt;/p&gt;</w:t>
+      </w:r>
+    </w:p>
+    <w:p>
+      <w:pPr>
+        <w:rPr>
+          <w:sz w:val="28"/>
+          <w:szCs w:val="28"/>
+        </w:rPr>
+      </w:pPr>
+      <w:r>
+        <w:rPr>
+          <w:rFonts w:ascii="Segoe UI Emoji" w:hAnsi="Segoe UI Emoji" w:cs="Segoe UI Emoji"/>
+          <w:sz w:val="28"/>
+          <w:szCs w:val="28"/>
+        </w:rPr>
+        <w:t>🧠</w:t>
+      </w:r>
+      <w:r>
+        <w:rPr>
+          <w:sz w:val="28"/>
+          <w:szCs w:val="28"/>
+        </w:rPr>
+        <w:t xml:space="preserve"> Explanation:</w:t>
+      </w:r>
+    </w:p>
+    <w:p>
+      <w:pPr>
+        <w:numPr>
+          <w:ilvl w:val="0"/>
+          <w:numId w:val="33"/>
+        </w:numPr>
+        <w:rPr>
+          <w:sz w:val="28"/>
+          <w:szCs w:val="28"/>
+        </w:rPr>
+      </w:pPr>
+      <w:r>
+        <w:rPr>
+          <w:sz w:val="28"/>
+          <w:szCs w:val="28"/>
+        </w:rPr>
+        <w:t>text-</w:t>
+      </w:r>
+      <w:proofErr w:type="spellStart"/>
+      <w:r>
+        <w:rPr>
+          <w:sz w:val="28"/>
+          <w:szCs w:val="28"/>
+        </w:rPr>
+        <w:t>sm</w:t>
+      </w:r>
+      <w:proofErr w:type="spellEnd"/>
+      <w:r>
+        <w:rPr>
+          <w:sz w:val="28"/>
+          <w:szCs w:val="28"/>
+        </w:rPr>
+        <w:t xml:space="preserve"> → default for all devices (smallest)</w:t>
+      </w:r>
+    </w:p>
+    <w:p>
+      <w:pPr>
+        <w:numPr>
+          <w:ilvl w:val="0"/>
+          <w:numId w:val="33"/>
+        </w:numPr>
+        <w:rPr>
+          <w:sz w:val="28"/>
+          <w:szCs w:val="28"/>
+        </w:rPr>
+      </w:pPr>
+      <w:proofErr w:type="spellStart"/>
+      <w:r>
+        <w:rPr>
+          <w:sz w:val="28"/>
+          <w:szCs w:val="28"/>
+        </w:rPr>
+        <w:t>sm:text-base</w:t>
+      </w:r>
+      <w:proofErr w:type="spellEnd"/>
+      <w:r>
+        <w:rPr>
+          <w:sz w:val="28"/>
+          <w:szCs w:val="28"/>
+        </w:rPr>
+        <w:t xml:space="preserve"> → at screen ≥ </w:t>
+      </w:r>
+      <w:r>
+        <w:rPr>
+          <w:b/>
+          <w:bCs/>
+          <w:sz w:val="28"/>
+          <w:szCs w:val="28"/>
+        </w:rPr>
+        <w:t>640px</w:t>
+      </w:r>
+    </w:p>
+    <w:p>
+      <w:pPr>
+        <w:numPr>
+          <w:ilvl w:val="0"/>
+          <w:numId w:val="33"/>
+        </w:numPr>
+        <w:rPr>
+          <w:sz w:val="28"/>
+          <w:szCs w:val="28"/>
+        </w:rPr>
+      </w:pPr>
+      <w:proofErr w:type="spellStart"/>
+      <w:r>
+        <w:rPr>
+          <w:sz w:val="28"/>
+          <w:szCs w:val="28"/>
+        </w:rPr>
+        <w:t>md:text-lg</w:t>
+      </w:r>
+      <w:proofErr w:type="spellEnd"/>
+      <w:r>
+        <w:rPr>
+          <w:sz w:val="28"/>
+          <w:szCs w:val="28"/>
+        </w:rPr>
+        <w:t xml:space="preserve"> → at screen ≥ </w:t>
+      </w:r>
+      <w:r>
+        <w:rPr>
+          <w:b/>
+          <w:bCs/>
+          <w:sz w:val="28"/>
+          <w:szCs w:val="28"/>
+        </w:rPr>
+        <w:t>768px</w:t>
+      </w:r>
+    </w:p>
+    <w:p>
+      <w:pPr>
+        <w:numPr>
+          <w:ilvl w:val="0"/>
+          <w:numId w:val="33"/>
+        </w:numPr>
+        <w:rPr>
+          <w:sz w:val="28"/>
+          <w:szCs w:val="28"/>
+        </w:rPr>
+      </w:pPr>
+      <w:proofErr w:type="spellStart"/>
+      <w:r>
+        <w:rPr>
+          <w:sz w:val="28"/>
+          <w:szCs w:val="28"/>
+        </w:rPr>
+        <w:t>lg:text-xl</w:t>
+      </w:r>
+      <w:proofErr w:type="spellEnd"/>
+      <w:r>
+        <w:rPr>
+          <w:sz w:val="28"/>
+          <w:szCs w:val="28"/>
+        </w:rPr>
+        <w:t xml:space="preserve"> → at screen ≥ </w:t>
+      </w:r>
+      <w:r>
+        <w:rPr>
+          <w:b/>
+          <w:bCs/>
+          <w:sz w:val="28"/>
+          <w:szCs w:val="28"/>
+        </w:rPr>
+        <w:t>1024px</w:t>
+      </w:r>
+    </w:p>
+    <w:p>
+      <w:pPr>
+        <w:numPr>
+          <w:ilvl w:val="0"/>
+          <w:numId w:val="33"/>
+        </w:numPr>
+        <w:rPr>
+          <w:sz w:val="28"/>
+          <w:szCs w:val="28"/>
+        </w:rPr>
+      </w:pPr>
+      <w:r>
+        <w:rPr>
+          <w:sz w:val="28"/>
+          <w:szCs w:val="28"/>
+        </w:rPr>
+        <w:t xml:space="preserve">xl:text-2xl → at screen ≥ </w:t>
+      </w:r>
+      <w:r>
+        <w:rPr>
+          <w:b/>
+          <w:bCs/>
+          <w:sz w:val="28"/>
+          <w:szCs w:val="28"/>
+        </w:rPr>
+        <w:t>1280px</w:t>
+      </w:r>
+    </w:p>
+    <w:p>
+      <w:pPr>
+        <w:rPr>
+          <w:sz w:val="28"/>
+          <w:szCs w:val="28"/>
+        </w:rPr>
+      </w:pPr>
+      <w:r>
+        <w:rPr>
+          <w:rFonts w:ascii="Segoe UI Emoji" w:hAnsi="Segoe UI Emoji" w:cs="Segoe UI Emoji"/>
+          <w:sz w:val="28"/>
+          <w:szCs w:val="28"/>
+        </w:rPr>
+        <w:t>✅</w:t>
+      </w:r>
+      <w:r>
+        <w:rPr>
+          <w:sz w:val="28"/>
+          <w:szCs w:val="28"/>
+        </w:rPr>
+        <w:t xml:space="preserve"> So as screen grows, the text size grows.</w:t>
+      </w:r>
+    </w:p>
+    <w:p>
+      <w:pPr>
+        <w:rPr>
+          <w:sz w:val="28"/>
+          <w:szCs w:val="28"/>
+        </w:rPr>
+      </w:pPr>
+      <w:r>
+        <w:rPr>
+          <w:sz w:val="28"/>
+          <w:szCs w:val="28"/>
+        </w:rPr>
+        <w:pict w14:anchorId="62C0CD25">
+          <v:rect id="_x0000_i1075" style="width:0;height:1.5pt" o:hralign="center" o:hrstd="t" o:hr="t" fillcolor="#a0a0a0" stroked="f"/>
+        </w:pict>
+      </w:r>
+    </w:p>
+    <w:p>
+      <w:pPr>
+        <w:rPr>
+          <w:b/>
+          <w:bCs/>
+          <w:sz w:val="28"/>
+          <w:szCs w:val="28"/>
+        </w:rPr>
+      </w:pPr>
+      <w:r>
+        <w:rPr>
+          <w:rFonts w:ascii="Segoe UI Emoji" w:hAnsi="Segoe UI Emoji" w:cs="Segoe UI Emoji"/>
+          <w:b/>
+          <w:bCs/>
+          <w:sz w:val="28"/>
+          <w:szCs w:val="28"/>
+        </w:rPr>
+        <w:t>🧱</w:t>
+      </w:r>
+      <w:r>
+        <w:rPr>
+          <w:b/>
+          <w:bCs/>
+          <w:sz w:val="28"/>
+          <w:szCs w:val="28"/>
+        </w:rPr>
+        <w:t xml:space="preserve"> STEP 2: Tailwind’s Default Breakpoints</w:t>
+      </w:r>
+    </w:p>
+    <w:tbl>
+      <w:tblPr>
+        <w:tblW w:w="0" w:type="auto"/>
+        <w:tblCellSpacing w:w="15" w:type="dxa"/>
+        <w:tblCellMar>
+          <w:top w:w="15" w:type="dxa"/>
+          <w:left w:w="15" w:type="dxa"/>
+          <w:bottom w:w="15" w:type="dxa"/>
+          <w:right w:w="15" w:type="dxa"/>
+        </w:tblCellMar>
+        <w:tblLook w:val="04A0" w:firstRow="1" w:lastRow="0" w:firstColumn="1" w:lastColumn="0" w:noHBand="0" w:noVBand="1"/>
+      </w:tblPr>
+      <w:tblGrid>
+        <w:gridCol w:w="806"/>
+        <w:gridCol w:w="1936"/>
+        <w:gridCol w:w="2021"/>
+      </w:tblGrid>
+      <w:tr>
+        <w:trPr>
+          <w:tblHeader/>
+          <w:tblCellSpacing w:w="15" w:type="dxa"/>
+        </w:trPr>
+        <w:tc>
+          <w:tcPr>
+            <w:tcW w:w="0" w:type="auto"/>
+            <w:vAlign w:val="center"/>
+            <w:hideMark/>
+          </w:tcPr>
+          <w:p>
+            <w:pPr>
+              <w:rPr>
+                <w:b/>
+                <w:bCs/>
+                <w:sz w:val="28"/>
+                <w:szCs w:val="28"/>
+              </w:rPr>
+            </w:pPr>
+            <w:r>
+              <w:rPr>
+                <w:b/>
+                <w:bCs/>
+                <w:sz w:val="28"/>
+                <w:szCs w:val="28"/>
+              </w:rPr>
+              <w:t>Prefix</w:t>
+            </w:r>
+          </w:p>
+        </w:tc>
+        <w:tc>
+          <w:tcPr>
+            <w:tcW w:w="0" w:type="auto"/>
+            <w:vAlign w:val="center"/>
+            <w:hideMark/>
+          </w:tcPr>
+          <w:p>
+            <w:pPr>
+              <w:rPr>
+                <w:b/>
+                <w:bCs/>
+                <w:sz w:val="28"/>
+                <w:szCs w:val="28"/>
+              </w:rPr>
+            </w:pPr>
+            <w:r>
+              <w:rPr>
+                <w:b/>
+                <w:bCs/>
+                <w:sz w:val="28"/>
+                <w:szCs w:val="28"/>
+              </w:rPr>
+              <w:t>Screen width ≥</w:t>
+            </w:r>
+          </w:p>
+        </w:tc>
+        <w:tc>
+          <w:tcPr>
+            <w:tcW w:w="0" w:type="auto"/>
+            <w:vAlign w:val="center"/>
+            <w:hideMark/>
+          </w:tcPr>
+          <w:p>
+            <w:pPr>
+              <w:rPr>
+                <w:b/>
+                <w:bCs/>
+                <w:sz w:val="28"/>
+                <w:szCs w:val="28"/>
+              </w:rPr>
+            </w:pPr>
+            <w:r>
+              <w:rPr>
+                <w:b/>
+                <w:bCs/>
+                <w:sz w:val="28"/>
+                <w:szCs w:val="28"/>
+              </w:rPr>
+              <w:t>Example Usage</w:t>
+            </w:r>
+          </w:p>
+        </w:tc>
+      </w:tr>
+      <w:tr>
+        <w:trPr>
+          <w:tblCellSpacing w:w="15" w:type="dxa"/>
+        </w:trPr>
+        <w:tc>
+          <w:tcPr>
+            <w:tcW w:w="0" w:type="auto"/>
+            <w:vAlign w:val="center"/>
+            <w:hideMark/>
+          </w:tcPr>
+          <w:p>
+            <w:pPr>
+              <w:rPr>
+                <w:sz w:val="28"/>
+                <w:szCs w:val="28"/>
+              </w:rPr>
+            </w:pPr>
+            <w:proofErr w:type="spellStart"/>
+            <w:r>
+              <w:rPr>
+                <w:sz w:val="28"/>
+                <w:szCs w:val="28"/>
+              </w:rPr>
+              <w:t>sm</w:t>
+            </w:r>
+            <w:proofErr w:type="spellEnd"/>
+            <w:r>
+              <w:rPr>
+                <w:sz w:val="28"/>
+                <w:szCs w:val="28"/>
+              </w:rPr>
+              <w:t>:</w:t>
+            </w:r>
+          </w:p>
+        </w:tc>
+        <w:tc>
+          <w:tcPr>
+            <w:tcW w:w="0" w:type="auto"/>
+            <w:vAlign w:val="center"/>
+            <w:hideMark/>
+          </w:tcPr>
+          <w:p>
+            <w:pPr>
+              <w:rPr>
+                <w:sz w:val="28"/>
+                <w:szCs w:val="28"/>
+              </w:rPr>
+            </w:pPr>
+            <w:r>
+              <w:rPr>
+                <w:sz w:val="28"/>
+                <w:szCs w:val="28"/>
+              </w:rPr>
+              <w:t>640px</w:t>
+            </w:r>
+          </w:p>
+        </w:tc>
+        <w:tc>
+          <w:tcPr>
+            <w:tcW w:w="0" w:type="auto"/>
+            <w:vAlign w:val="center"/>
+            <w:hideMark/>
+          </w:tcPr>
+          <w:p>
+            <w:pPr>
+              <w:rPr>
+                <w:sz w:val="28"/>
+                <w:szCs w:val="28"/>
+              </w:rPr>
+            </w:pPr>
+            <w:r>
+              <w:rPr>
+                <w:sz w:val="28"/>
+                <w:szCs w:val="28"/>
+              </w:rPr>
+              <w:t>small tablets</w:t>
+            </w:r>
+          </w:p>
+        </w:tc>
+      </w:tr>
+      <w:tr>
+        <w:trPr>
+          <w:tblCellSpacing w:w="15" w:type="dxa"/>
+        </w:trPr>
+        <w:tc>
+          <w:tcPr>
+            <w:tcW w:w="0" w:type="auto"/>
+            <w:vAlign w:val="center"/>
+            <w:hideMark/>
+          </w:tcPr>
+          <w:p>
+            <w:pPr>
+              <w:rPr>
+                <w:sz w:val="28"/>
+                <w:szCs w:val="28"/>
+              </w:rPr>
+            </w:pPr>
+            <w:r>
+              <w:rPr>
+                <w:sz w:val="28"/>
+                <w:szCs w:val="28"/>
+              </w:rPr>
+              <w:t>md:</w:t>
+            </w:r>
+          </w:p>
+        </w:tc>
+        <w:tc>
+          <w:tcPr>
+            <w:tcW w:w="0" w:type="auto"/>
+            <w:vAlign w:val="center"/>
+            <w:hideMark/>
+          </w:tcPr>
+          <w:p>
+            <w:pPr>
+              <w:rPr>
+                <w:sz w:val="28"/>
+                <w:szCs w:val="28"/>
+              </w:rPr>
+            </w:pPr>
+            <w:r>
+              <w:rPr>
+                <w:sz w:val="28"/>
+                <w:szCs w:val="28"/>
+              </w:rPr>
+              <w:t>768px</w:t>
+            </w:r>
+          </w:p>
+        </w:tc>
+        <w:tc>
+          <w:tcPr>
+            <w:tcW w:w="0" w:type="auto"/>
+            <w:vAlign w:val="center"/>
+            <w:hideMark/>
+          </w:tcPr>
+          <w:p>
+            <w:pPr>
+              <w:rPr>
+                <w:sz w:val="28"/>
+                <w:szCs w:val="28"/>
+              </w:rPr>
+            </w:pPr>
+            <w:r>
+              <w:rPr>
+                <w:sz w:val="28"/>
+                <w:szCs w:val="28"/>
+              </w:rPr>
+              <w:t>tablets</w:t>
+            </w:r>
+          </w:p>
+        </w:tc>
+      </w:tr>
+      <w:tr>
+        <w:trPr>
+          <w:tblCellSpacing w:w="15" w:type="dxa"/>
+        </w:trPr>
+        <w:tc>
+          <w:tcPr>
+            <w:tcW w:w="0" w:type="auto"/>
+            <w:vAlign w:val="center"/>
+            <w:hideMark/>
+          </w:tcPr>
+          <w:p>
+            <w:pPr>
+              <w:rPr>
+                <w:sz w:val="28"/>
+                <w:szCs w:val="28"/>
+              </w:rPr>
+            </w:pPr>
+            <w:r>
+              <w:rPr>
+                <w:sz w:val="28"/>
+                <w:szCs w:val="28"/>
+              </w:rPr>
+              <w:t>lg:</w:t>
+            </w:r>
+          </w:p>
+        </w:tc>
+        <w:tc>
+          <w:tcPr>
+            <w:tcW w:w="0" w:type="auto"/>
+            <w:vAlign w:val="center"/>
+            <w:hideMark/>
+          </w:tcPr>
+          <w:p>
+            <w:pPr>
+              <w:rPr>
+                <w:sz w:val="28"/>
+                <w:szCs w:val="28"/>
+              </w:rPr>
+            </w:pPr>
+            <w:r>
+              <w:rPr>
+                <w:sz w:val="28"/>
+                <w:szCs w:val="28"/>
+              </w:rPr>
+              <w:t>1024px</w:t>
+            </w:r>
+          </w:p>
+        </w:tc>
+        <w:tc>
+          <w:tcPr>
+            <w:tcW w:w="0" w:type="auto"/>
+            <w:vAlign w:val="center"/>
+            <w:hideMark/>
+          </w:tcPr>
+          <w:p>
+            <w:pPr>
+              <w:rPr>
+                <w:sz w:val="28"/>
+                <w:szCs w:val="28"/>
+              </w:rPr>
+            </w:pPr>
+            <w:r>
+              <w:rPr>
+                <w:sz w:val="28"/>
+                <w:szCs w:val="28"/>
+              </w:rPr>
+              <w:t>laptops</w:t>
+            </w:r>
+          </w:p>
+        </w:tc>
+      </w:tr>
+      <w:tr>
+        <w:trPr>
+          <w:tblCellSpacing w:w="15" w:type="dxa"/>
+        </w:trPr>
+        <w:tc>
+          <w:tcPr>
+            <w:tcW w:w="0" w:type="auto"/>
+            <w:vAlign w:val="center"/>
+            <w:hideMark/>
+          </w:tcPr>
+          <w:p>
+            <w:pPr>
+              <w:rPr>
+                <w:sz w:val="28"/>
+                <w:szCs w:val="28"/>
+              </w:rPr>
+            </w:pPr>
+            <w:r>
+              <w:rPr>
+                <w:sz w:val="28"/>
+                <w:szCs w:val="28"/>
+              </w:rPr>
+              <w:t>xl:</w:t>
+            </w:r>
+          </w:p>
+        </w:tc>
+        <w:tc>
+          <w:tcPr>
+            <w:tcW w:w="0" w:type="auto"/>
+            <w:vAlign w:val="center"/>
+            <w:hideMark/>
+          </w:tcPr>
+          <w:p>
+            <w:pPr>
+              <w:rPr>
+                <w:sz w:val="28"/>
+                <w:szCs w:val="28"/>
+              </w:rPr>
+            </w:pPr>
+            <w:r>
+              <w:rPr>
+                <w:sz w:val="28"/>
+                <w:szCs w:val="28"/>
+              </w:rPr>
+              <w:t>1280px</w:t>
+            </w:r>
+          </w:p>
+        </w:tc>
+        <w:tc>
+          <w:tcPr>
+            <w:tcW w:w="0" w:type="auto"/>
+            <w:vAlign w:val="center"/>
+            <w:hideMark/>
+          </w:tcPr>
+          <w:p>
+            <w:pPr>
+              <w:rPr>
+                <w:sz w:val="28"/>
+                <w:szCs w:val="28"/>
+              </w:rPr>
+            </w:pPr>
+            <w:r>
+              <w:rPr>
+                <w:sz w:val="28"/>
+                <w:szCs w:val="28"/>
+              </w:rPr>
+              <w:t>desktops</w:t>
+            </w:r>
+          </w:p>
+        </w:tc>
+      </w:tr>
+      <w:tr>
+        <w:trPr>
+          <w:tblCellSpacing w:w="15" w:type="dxa"/>
+        </w:trPr>
+        <w:tc>
+          <w:tcPr>
+            <w:tcW w:w="0" w:type="auto"/>
+            <w:vAlign w:val="center"/>
+            <w:hideMark/>
+          </w:tcPr>
+          <w:p>
+            <w:pPr>
+              <w:rPr>
+                <w:sz w:val="28"/>
+                <w:szCs w:val="28"/>
+              </w:rPr>
+            </w:pPr>
+            <w:r>
+              <w:rPr>
+                <w:sz w:val="28"/>
+                <w:szCs w:val="28"/>
+              </w:rPr>
+              <w:lastRenderedPageBreak/>
+              <w:t>2xl:</w:t>
+            </w:r>
+          </w:p>
+        </w:tc>
+        <w:tc>
+          <w:tcPr>
+            <w:tcW w:w="0" w:type="auto"/>
+            <w:vAlign w:val="center"/>
+            <w:hideMark/>
+          </w:tcPr>
+          <w:p>
+            <w:pPr>
+              <w:rPr>
+                <w:sz w:val="28"/>
+                <w:szCs w:val="28"/>
+              </w:rPr>
+            </w:pPr>
+            <w:r>
+              <w:rPr>
+                <w:sz w:val="28"/>
+                <w:szCs w:val="28"/>
+              </w:rPr>
+              <w:t>1536px</w:t>
+            </w:r>
+          </w:p>
+        </w:tc>
+        <w:tc>
+          <w:tcPr>
+            <w:tcW w:w="0" w:type="auto"/>
+            <w:vAlign w:val="center"/>
+            <w:hideMark/>
+          </w:tcPr>
+          <w:p>
+            <w:pPr>
+              <w:rPr>
+                <w:sz w:val="28"/>
+                <w:szCs w:val="28"/>
+              </w:rPr>
+            </w:pPr>
+            <w:r>
+              <w:rPr>
+                <w:sz w:val="28"/>
+                <w:szCs w:val="28"/>
+              </w:rPr>
+              <w:t>large screens</w:t>
+            </w:r>
+          </w:p>
+        </w:tc>
+      </w:tr>
+    </w:tbl>
+    <w:p>
+      <w:pPr>
+        <w:rPr>
+          <w:sz w:val="28"/>
+          <w:szCs w:val="28"/>
+        </w:rPr>
+      </w:pPr>
+      <w:r>
+        <w:rPr>
+          <w:rFonts w:ascii="Segoe UI Emoji" w:hAnsi="Segoe UI Emoji" w:cs="Segoe UI Emoji"/>
+          <w:sz w:val="28"/>
+          <w:szCs w:val="28"/>
+        </w:rPr>
+        <w:t>📌</w:t>
+      </w:r>
+      <w:r>
+        <w:rPr>
+          <w:sz w:val="28"/>
+          <w:szCs w:val="28"/>
+        </w:rPr>
+        <w:t xml:space="preserve"> You can </w:t>
+      </w:r>
+      <w:r>
+        <w:rPr>
+          <w:b/>
+          <w:bCs/>
+          <w:sz w:val="28"/>
+          <w:szCs w:val="28"/>
+        </w:rPr>
+        <w:t>customize</w:t>
+      </w:r>
+      <w:r>
+        <w:rPr>
+          <w:sz w:val="28"/>
+          <w:szCs w:val="28"/>
+        </w:rPr>
+        <w:t xml:space="preserve"> these in your tailwind.config.js, but for now we’ll use defaults.</w:t>
+      </w:r>
+    </w:p>
+    <w:p>
+      <w:pPr>
+        <w:rPr>
+          <w:sz w:val="28"/>
+          <w:szCs w:val="28"/>
+        </w:rPr>
+      </w:pPr>
+      <w:r>
+        <w:rPr>
+          <w:sz w:val="28"/>
+          <w:szCs w:val="28"/>
+        </w:rPr>
+        <w:pict w14:anchorId="198ADEA8">
+          <v:rect id="_x0000_i1076" style="width:0;height:1.5pt" o:hralign="center" o:hrstd="t" o:hr="t" fillcolor="#a0a0a0" stroked="f"/>
+        </w:pict>
+      </w:r>
+    </w:p>
+    <w:p>
+      <w:pPr>
+        <w:rPr>
+          <w:b/>
+          <w:bCs/>
+          <w:sz w:val="28"/>
+          <w:szCs w:val="28"/>
+        </w:rPr>
+      </w:pPr>
+      <w:r>
+        <w:rPr>
+          <w:rFonts w:ascii="Segoe UI Emoji" w:hAnsi="Segoe UI Emoji" w:cs="Segoe UI Emoji"/>
+          <w:b/>
+          <w:bCs/>
+          <w:sz w:val="28"/>
+          <w:szCs w:val="28"/>
+        </w:rPr>
+        <w:t>🪞</w:t>
+      </w:r>
+      <w:r>
+        <w:rPr>
+          <w:b/>
+          <w:bCs/>
+          <w:sz w:val="28"/>
+          <w:szCs w:val="28"/>
+        </w:rPr>
+        <w:t xml:space="preserve"> STEP 3: Practical Example (Responsive Flex Layout)</w:t>
+      </w:r>
+    </w:p>
+    <w:p>
+      <w:pPr>
+        <w:rPr>
+          <w:b/>
+          <w:bCs/>
+          <w:sz w:val="28"/>
+          <w:szCs w:val="28"/>
+        </w:rPr>
+      </w:pPr>
+      <w:r>
+        <w:rPr>
+          <w:rFonts w:ascii="Segoe UI Emoji" w:hAnsi="Segoe UI Emoji" w:cs="Segoe UI Emoji"/>
+          <w:b/>
+          <w:bCs/>
+          <w:sz w:val="28"/>
+          <w:szCs w:val="28"/>
+        </w:rPr>
+        <w:t>🧩</w:t>
+      </w:r>
+      <w:r>
+        <w:rPr>
+          <w:b/>
+          <w:bCs/>
+          <w:sz w:val="28"/>
+          <w:szCs w:val="28"/>
+        </w:rPr>
+        <w:t xml:space="preserve"> Example 2 — 2 Boxes side by side on large, stacked on mobile</w:t>
+      </w:r>
+    </w:p>
+    <w:p>
+      <w:pPr>
+        <w:rPr>
+          <w:sz w:val="28"/>
+          <w:szCs w:val="28"/>
+        </w:rPr>
+      </w:pPr>
+      <w:r>
+        <w:rPr>
+          <w:sz w:val="28"/>
+          <w:szCs w:val="28"/>
+        </w:rPr>
+        <w:t>&lt;div class=</w:t>
+      </w:r>
+      <w:proofErr w:type="gramStart"/>
+      <w:r>
+        <w:rPr>
+          <w:sz w:val="28"/>
+          <w:szCs w:val="28"/>
+        </w:rPr>
+        <w:t xml:space="preserve">"flex </w:t>
+      </w:r>
+      <w:proofErr w:type="gramEnd"/>
+      <w:r>
+        <w:rPr>
+          <w:sz w:val="28"/>
+          <w:szCs w:val="28"/>
+        </w:rPr>
+        <w:t xml:space="preserve">flex-col </w:t>
+      </w:r>
+      <w:proofErr w:type="spellStart"/>
+      <w:proofErr w:type="gramStart"/>
+      <w:r>
+        <w:rPr>
+          <w:sz w:val="28"/>
+          <w:szCs w:val="28"/>
+        </w:rPr>
+        <w:t>md:flex</w:t>
+      </w:r>
+      <w:proofErr w:type="gramEnd"/>
+      <w:r>
+        <w:rPr>
+          <w:sz w:val="28"/>
+          <w:szCs w:val="28"/>
+        </w:rPr>
+        <w:t>-row</w:t>
+      </w:r>
+      <w:proofErr w:type="spellEnd"/>
+      <w:r>
+        <w:rPr>
+          <w:sz w:val="28"/>
+          <w:szCs w:val="28"/>
+        </w:rPr>
+        <w:t xml:space="preserve"> gap-4 p-4"&gt;</w:t>
+      </w:r>
+    </w:p>
+    <w:p>
+      <w:pPr>
+        <w:rPr>
+          <w:sz w:val="28"/>
+          <w:szCs w:val="28"/>
+        </w:rPr>
+      </w:pPr>
+      <w:r>
+        <w:rPr>
+          <w:sz w:val="28"/>
+          <w:szCs w:val="28"/>
+        </w:rPr>
+        <w:t xml:space="preserve">  &lt;div class="bg-blue-300 p-4 flex-1 text-center"&gt;Box 1&lt;/div&gt;</w:t>
+      </w:r>
+    </w:p>
+    <w:p>
+      <w:pPr>
+        <w:rPr>
+          <w:sz w:val="28"/>
+          <w:szCs w:val="28"/>
+        </w:rPr>
+      </w:pPr>
+      <w:r>
+        <w:rPr>
+          <w:sz w:val="28"/>
+          <w:szCs w:val="28"/>
+        </w:rPr>
+        <w:t xml:space="preserve">  &lt;div class="bg-pink-300 p-4 flex-1 text-center"&gt;Box 2&lt;/div&gt;</w:t>
+      </w:r>
+    </w:p>
+    <w:p>
+      <w:pPr>
+        <w:rPr>
+          <w:sz w:val="28"/>
+          <w:szCs w:val="28"/>
+        </w:rPr>
+      </w:pPr>
+      <w:r>
+        <w:rPr>
+          <w:sz w:val="28"/>
+          <w:szCs w:val="28"/>
+        </w:rPr>
+        <w:t>&lt;/div&gt;</w:t>
+      </w:r>
+    </w:p>
+    <w:p>
+      <w:pPr>
+        <w:rPr>
+          <w:sz w:val="28"/>
+          <w:szCs w:val="28"/>
+        </w:rPr>
+      </w:pPr>
+      <w:r>
+        <w:rPr>
+          <w:rFonts w:ascii="Segoe UI Emoji" w:hAnsi="Segoe UI Emoji" w:cs="Segoe UI Emoji"/>
+          <w:sz w:val="28"/>
+          <w:szCs w:val="28"/>
+        </w:rPr>
+        <w:t>🧠</w:t>
+      </w:r>
+      <w:r>
+        <w:rPr>
+          <w:sz w:val="28"/>
+          <w:szCs w:val="28"/>
+        </w:rPr>
+        <w:t xml:space="preserve"> Explanation:</w:t>
+      </w:r>
+    </w:p>
+    <w:p>
+      <w:pPr>
+        <w:numPr>
+          <w:ilvl w:val="0"/>
+          <w:numId w:val="34"/>
+        </w:numPr>
+        <w:rPr>
+          <w:sz w:val="28"/>
+          <w:szCs w:val="28"/>
+        </w:rPr>
+      </w:pPr>
+      <w:r>
+        <w:rPr>
+          <w:sz w:val="28"/>
+          <w:szCs w:val="28"/>
+        </w:rPr>
+        <w:t>flex flex-</w:t>
+      </w:r>
+      <w:proofErr w:type="gramStart"/>
+      <w:r>
+        <w:rPr>
+          <w:sz w:val="28"/>
+          <w:szCs w:val="28"/>
+        </w:rPr>
+        <w:t>col →</w:t>
+      </w:r>
+      <w:proofErr w:type="gramEnd"/>
+      <w:r>
+        <w:rPr>
+          <w:sz w:val="28"/>
+          <w:szCs w:val="28"/>
+        </w:rPr>
+        <w:t xml:space="preserve"> By default, </w:t>
+      </w:r>
+      <w:r>
+        <w:rPr>
+          <w:b/>
+          <w:bCs/>
+          <w:sz w:val="28"/>
+          <w:szCs w:val="28"/>
+        </w:rPr>
+        <w:t>stack vertically</w:t>
+      </w:r>
+      <w:r>
+        <w:rPr>
+          <w:sz w:val="28"/>
+          <w:szCs w:val="28"/>
+        </w:rPr>
+        <w:t xml:space="preserve"> (mobile view)</w:t>
+      </w:r>
+    </w:p>
+    <w:p>
+      <w:pPr>
+        <w:numPr>
+          <w:ilvl w:val="0"/>
+          <w:numId w:val="34"/>
+        </w:numPr>
+        <w:rPr>
+          <w:sz w:val="28"/>
+          <w:szCs w:val="28"/>
+        </w:rPr>
+      </w:pPr>
+      <w:proofErr w:type="spellStart"/>
+      <w:proofErr w:type="gramStart"/>
+      <w:r>
+        <w:rPr>
+          <w:sz w:val="28"/>
+          <w:szCs w:val="28"/>
+        </w:rPr>
+        <w:t>md:flex</w:t>
+      </w:r>
+      <w:proofErr w:type="gramEnd"/>
+      <w:r>
+        <w:rPr>
+          <w:sz w:val="28"/>
+          <w:szCs w:val="28"/>
+        </w:rPr>
+        <w:t>-row</w:t>
+      </w:r>
+      <w:proofErr w:type="spellEnd"/>
+      <w:r>
+        <w:rPr>
+          <w:sz w:val="28"/>
+          <w:szCs w:val="28"/>
+        </w:rPr>
+        <w:t xml:space="preserve"> → From 768px+, </w:t>
+      </w:r>
+      <w:r>
+        <w:rPr>
+          <w:b/>
+          <w:bCs/>
+          <w:sz w:val="28"/>
+          <w:szCs w:val="28"/>
+        </w:rPr>
+        <w:t>side-by-side horizontally</w:t>
+      </w:r>
+    </w:p>
+    <w:p>
+      <w:pPr>
+        <w:numPr>
+          <w:ilvl w:val="0"/>
+          <w:numId w:val="34"/>
+        </w:numPr>
+        <w:rPr>
+          <w:sz w:val="28"/>
+          <w:szCs w:val="28"/>
+        </w:rPr>
+      </w:pPr>
+      <w:r>
+        <w:rPr>
+          <w:sz w:val="28"/>
+          <w:szCs w:val="28"/>
+        </w:rPr>
+        <w:t>gap-4 → Space between them</w:t>
+      </w:r>
+    </w:p>
+    <w:p>
+      <w:pPr>
+        <w:numPr>
+          <w:ilvl w:val="0"/>
+          <w:numId w:val="34"/>
+        </w:numPr>
+        <w:rPr>
+          <w:sz w:val="28"/>
+          <w:szCs w:val="28"/>
+        </w:rPr>
+      </w:pPr>
+      <w:r>
+        <w:rPr>
+          <w:sz w:val="28"/>
+          <w:szCs w:val="28"/>
+        </w:rPr>
+        <w:t>flex-1 → Both take equal width</w:t>
+      </w:r>
+    </w:p>
+    <w:p>
+      <w:pPr>
+        <w:rPr>
+          <w:sz w:val="28"/>
+          <w:szCs w:val="28"/>
+        </w:rPr>
+      </w:pPr>
+      <w:r>
+        <w:rPr>
+          <w:rFonts w:ascii="Segoe UI Emoji" w:hAnsi="Segoe UI Emoji" w:cs="Segoe UI Emoji"/>
+          <w:sz w:val="28"/>
+          <w:szCs w:val="28"/>
+        </w:rPr>
+        <w:t>✅</w:t>
+      </w:r>
+      <w:r>
+        <w:rPr>
+          <w:sz w:val="28"/>
+          <w:szCs w:val="28"/>
+        </w:rPr>
+        <w:t xml:space="preserve"> Output:</w:t>
+      </w:r>
+    </w:p>
+    <w:p>
+      <w:pPr>
+        <w:numPr>
+          <w:ilvl w:val="0"/>
+          <w:numId w:val="35"/>
+        </w:numPr>
+        <w:rPr>
+          <w:sz w:val="28"/>
+          <w:szCs w:val="28"/>
+        </w:rPr>
+      </w:pPr>
+      <w:r>
+        <w:rPr>
+          <w:rFonts w:ascii="Segoe UI Emoji" w:hAnsi="Segoe UI Emoji" w:cs="Segoe UI Emoji"/>
+          <w:sz w:val="28"/>
+          <w:szCs w:val="28"/>
+        </w:rPr>
+        <w:t>📱</w:t>
+      </w:r>
+      <w:r>
+        <w:rPr>
+          <w:sz w:val="28"/>
+          <w:szCs w:val="28"/>
+        </w:rPr>
+        <w:t xml:space="preserve"> On mobile → Box1 on top, Box2 below</w:t>
+      </w:r>
+    </w:p>
+    <w:p>
+      <w:pPr>
+        <w:numPr>
+          <w:ilvl w:val="0"/>
+          <w:numId w:val="35"/>
+        </w:numPr>
+        <w:rPr>
+          <w:sz w:val="28"/>
+          <w:szCs w:val="28"/>
+        </w:rPr>
+      </w:pPr>
+      <w:r>
+        <w:rPr>
+          <w:rFonts w:ascii="Segoe UI Emoji" w:hAnsi="Segoe UI Emoji" w:cs="Segoe UI Emoji"/>
+          <w:sz w:val="28"/>
+          <w:szCs w:val="28"/>
+        </w:rPr>
+        <w:t>💻</w:t>
+      </w:r>
+      <w:r>
+        <w:rPr>
+          <w:sz w:val="28"/>
+          <w:szCs w:val="28"/>
+        </w:rPr>
+        <w:t xml:space="preserve"> On desktop → Box1 left, Box2 right</w:t>
+      </w:r>
+    </w:p>
+    <w:p>
+      <w:pPr>
+        <w:rPr>
+          <w:sz w:val="28"/>
+          <w:szCs w:val="28"/>
+        </w:rPr>
+      </w:pPr>
+      <w:r>
+        <w:rPr>
+          <w:sz w:val="28"/>
+          <w:szCs w:val="28"/>
+        </w:rPr>
+        <w:pict w14:anchorId="7F8CA12E">
+          <v:rect id="_x0000_i1077" style="width:0;height:1.5pt" o:hralign="center" o:hrstd="t" o:hr="t" fillcolor="#a0a0a0" stroked="f"/>
+        </w:pict>
+      </w:r>
+    </w:p>
+    <w:p>
+      <w:pPr>
+        <w:rPr>
+          <w:b/>
+          <w:bCs/>
+          <w:sz w:val="28"/>
+          <w:szCs w:val="28"/>
+        </w:rPr>
+      </w:pPr>
+      <w:r>
+        <w:rPr>
+          <w:rFonts w:ascii="Segoe UI Emoji" w:hAnsi="Segoe UI Emoji" w:cs="Segoe UI Emoji"/>
+          <w:b/>
+          <w:bCs/>
+          <w:sz w:val="28"/>
+          <w:szCs w:val="28"/>
+        </w:rPr>
+        <w:t>🧮</w:t>
+      </w:r>
+      <w:r>
+        <w:rPr>
+          <w:b/>
+          <w:bCs/>
+          <w:sz w:val="28"/>
+          <w:szCs w:val="28"/>
+        </w:rPr>
+        <w:t xml:space="preserve"> STEP 4: Responsive Grid Example</w:t>
+      </w:r>
+    </w:p>
+    <w:p>
+      <w:pPr>
+        <w:rPr>
+          <w:b/>
+          <w:bCs/>
+          <w:sz w:val="28"/>
+          <w:szCs w:val="28"/>
+        </w:rPr>
+      </w:pPr>
+      <w:r>
+        <w:rPr>
+          <w:rFonts w:ascii="Segoe UI Emoji" w:hAnsi="Segoe UI Emoji" w:cs="Segoe UI Emoji"/>
+          <w:b/>
+          <w:bCs/>
+          <w:sz w:val="28"/>
+          <w:szCs w:val="28"/>
+        </w:rPr>
+        <w:t>🧩</w:t>
+      </w:r>
+      <w:r>
+        <w:rPr>
+          <w:b/>
+          <w:bCs/>
+          <w:sz w:val="28"/>
+          <w:szCs w:val="28"/>
+        </w:rPr>
+        <w:t xml:space="preserve"> Example 3 — 1-column → 2-column → 3-column Grid</w:t>
+      </w:r>
+    </w:p>
+    <w:p>
+      <w:pPr>
+        <w:rPr>
+          <w:sz w:val="28"/>
+          <w:szCs w:val="28"/>
+        </w:rPr>
+      </w:pPr>
+      <w:r>
+        <w:rPr>
+          <w:sz w:val="28"/>
+          <w:szCs w:val="28"/>
+        </w:rPr>
+        <w:t xml:space="preserve">&lt;div class="grid grid-cols-1 </w:t>
+      </w:r>
+      <w:proofErr w:type="gramStart"/>
+      <w:r>
+        <w:rPr>
+          <w:sz w:val="28"/>
+          <w:szCs w:val="28"/>
+        </w:rPr>
+        <w:t>sm:grid</w:t>
+      </w:r>
+      <w:proofErr w:type="gramEnd"/>
+      <w:r>
+        <w:rPr>
+          <w:sz w:val="28"/>
+          <w:szCs w:val="28"/>
+        </w:rPr>
+        <w:t xml:space="preserve">-cols-2 </w:t>
+      </w:r>
+      <w:proofErr w:type="gramStart"/>
+      <w:r>
+        <w:rPr>
+          <w:sz w:val="28"/>
+          <w:szCs w:val="28"/>
+        </w:rPr>
+        <w:t>lg:grid</w:t>
+      </w:r>
+      <w:proofErr w:type="gramEnd"/>
+      <w:r>
+        <w:rPr>
+          <w:sz w:val="28"/>
+          <w:szCs w:val="28"/>
+        </w:rPr>
+        <w:t>-cols-3 gap-4 p-4"&gt;</w:t>
+      </w:r>
+    </w:p>
+    <w:p>
+      <w:pPr>
+        <w:rPr>
+          <w:sz w:val="28"/>
+          <w:szCs w:val="28"/>
+        </w:rPr>
+      </w:pPr>
+      <w:r>
+        <w:rPr>
+          <w:sz w:val="28"/>
+          <w:szCs w:val="28"/>
+        </w:rPr>
+        <w:lastRenderedPageBreak/>
+        <w:t xml:space="preserve">  &lt;div class="bg-red-300 p-4 text-center"&gt;Card 1&lt;/div&gt;</w:t>
+      </w:r>
+    </w:p>
+    <w:p>
+      <w:pPr>
+        <w:rPr>
+          <w:sz w:val="28"/>
+          <w:szCs w:val="28"/>
+        </w:rPr>
+      </w:pPr>
+      <w:r>
+        <w:rPr>
+          <w:sz w:val="28"/>
+          <w:szCs w:val="28"/>
+        </w:rPr>
+        <w:t xml:space="preserve">  &lt;div class="bg-yellow-300 p-4 text-center"&gt;Card 2&lt;/div&gt;</w:t>
+      </w:r>
+    </w:p>
+    <w:p>
+      <w:pPr>
+        <w:rPr>
+          <w:sz w:val="28"/>
+          <w:szCs w:val="28"/>
+        </w:rPr>
+      </w:pPr>
+      <w:r>
+        <w:rPr>
+          <w:sz w:val="28"/>
+          <w:szCs w:val="28"/>
+        </w:rPr>
+        <w:t xml:space="preserve">  &lt;div class="bg-green-300 p-4 text-center"&gt;Card 3&lt;/div&gt;</w:t>
+      </w:r>
+    </w:p>
+    <w:p>
+      <w:pPr>
+        <w:rPr>
+          <w:sz w:val="28"/>
+          <w:szCs w:val="28"/>
+        </w:rPr>
+      </w:pPr>
+      <w:r>
+        <w:rPr>
+          <w:sz w:val="28"/>
+          <w:szCs w:val="28"/>
+        </w:rPr>
+        <w:t>&lt;/div&gt;</w:t>
+      </w:r>
+    </w:p>
+    <w:p>
+      <w:pPr>
+        <w:rPr>
+          <w:sz w:val="28"/>
+          <w:szCs w:val="28"/>
+        </w:rPr>
+      </w:pPr>
+      <w:r>
+        <w:rPr>
+          <w:rFonts w:ascii="Segoe UI Emoji" w:hAnsi="Segoe UI Emoji" w:cs="Segoe UI Emoji"/>
+          <w:sz w:val="28"/>
+          <w:szCs w:val="28"/>
+        </w:rPr>
+        <w:t>🧠</w:t>
+      </w:r>
+      <w:r>
+        <w:rPr>
+          <w:sz w:val="28"/>
+          <w:szCs w:val="28"/>
+        </w:rPr>
+        <w:t xml:space="preserve"> Explanation:</w:t>
+      </w:r>
+    </w:p>
+    <w:p>
+      <w:pPr>
+        <w:numPr>
+          <w:ilvl w:val="0"/>
+          <w:numId w:val="36"/>
+        </w:numPr>
+        <w:rPr>
+          <w:sz w:val="28"/>
+          <w:szCs w:val="28"/>
+        </w:rPr>
+      </w:pPr>
+      <w:r>
+        <w:rPr>
+          <w:sz w:val="28"/>
+          <w:szCs w:val="28"/>
+        </w:rPr>
+        <w:t>grid-cols-1 → Default: 1 column (mobile)</w:t>
+      </w:r>
+    </w:p>
+    <w:p>
+      <w:pPr>
+        <w:numPr>
+          <w:ilvl w:val="0"/>
+          <w:numId w:val="36"/>
+        </w:numPr>
+        <w:rPr>
+          <w:sz w:val="28"/>
+          <w:szCs w:val="28"/>
+        </w:rPr>
+      </w:pPr>
+      <w:proofErr w:type="gramStart"/>
+      <w:r>
+        <w:rPr>
+          <w:sz w:val="28"/>
+          <w:szCs w:val="28"/>
+        </w:rPr>
+        <w:t>sm:grid</w:t>
+      </w:r>
+      <w:proofErr w:type="gramEnd"/>
+      <w:r>
+        <w:rPr>
+          <w:sz w:val="28"/>
+          <w:szCs w:val="28"/>
+        </w:rPr>
+        <w:t>-</w:t>
+      </w:r>
+      <w:proofErr w:type="gramStart"/>
+      <w:r>
+        <w:rPr>
+          <w:sz w:val="28"/>
+          <w:szCs w:val="28"/>
+        </w:rPr>
+        <w:t>cols</w:t>
+      </w:r>
+      <w:proofErr w:type="gramEnd"/>
+      <w:r>
+        <w:rPr>
+          <w:sz w:val="28"/>
+          <w:szCs w:val="28"/>
+        </w:rPr>
+        <w:t>-2 → 2 columns on small screens</w:t>
+      </w:r>
+    </w:p>
+    <w:p>
+      <w:pPr>
+        <w:numPr>
+          <w:ilvl w:val="0"/>
+          <w:numId w:val="36"/>
+        </w:numPr>
+        <w:rPr>
+          <w:sz w:val="28"/>
+          <w:szCs w:val="28"/>
+        </w:rPr>
+      </w:pPr>
+      <w:proofErr w:type="gramStart"/>
+      <w:r>
+        <w:rPr>
+          <w:sz w:val="28"/>
+          <w:szCs w:val="28"/>
+        </w:rPr>
+        <w:t>lg:grid</w:t>
+      </w:r>
+      <w:proofErr w:type="gramEnd"/>
+      <w:r>
+        <w:rPr>
+          <w:sz w:val="28"/>
+          <w:szCs w:val="28"/>
+        </w:rPr>
+        <w:t>-</w:t>
+      </w:r>
+      <w:proofErr w:type="gramStart"/>
+      <w:r>
+        <w:rPr>
+          <w:sz w:val="28"/>
+          <w:szCs w:val="28"/>
+        </w:rPr>
+        <w:t>cols</w:t>
+      </w:r>
+      <w:proofErr w:type="gramEnd"/>
+      <w:r>
+        <w:rPr>
+          <w:sz w:val="28"/>
+          <w:szCs w:val="28"/>
+        </w:rPr>
+        <w:t>-3 → 3 columns on large screens</w:t>
+      </w:r>
+    </w:p>
+    <w:p>
+      <w:pPr>
+        <w:rPr>
+          <w:sz w:val="28"/>
+          <w:szCs w:val="28"/>
+        </w:rPr>
+      </w:pPr>
+      <w:r>
+        <w:rPr>
+          <w:rFonts w:ascii="Segoe UI Emoji" w:hAnsi="Segoe UI Emoji" w:cs="Segoe UI Emoji"/>
+          <w:sz w:val="28"/>
+          <w:szCs w:val="28"/>
+        </w:rPr>
+        <w:t>✅</w:t>
+      </w:r>
+      <w:r>
+        <w:rPr>
+          <w:sz w:val="28"/>
+          <w:szCs w:val="28"/>
+        </w:rPr>
+        <w:t xml:space="preserve"> Output:</w:t>
+      </w:r>
+    </w:p>
+    <w:p>
+      <w:pPr>
+        <w:numPr>
+          <w:ilvl w:val="0"/>
+          <w:numId w:val="37"/>
+        </w:numPr>
+        <w:rPr>
+          <w:sz w:val="28"/>
+          <w:szCs w:val="28"/>
+        </w:rPr>
+      </w:pPr>
+      <w:r>
+        <w:rPr>
+          <w:sz w:val="28"/>
+          <w:szCs w:val="28"/>
+        </w:rPr>
+        <w:t>Mobile → 1 column</w:t>
+      </w:r>
+    </w:p>
+    <w:p>
+      <w:pPr>
+        <w:numPr>
+          <w:ilvl w:val="0"/>
+          <w:numId w:val="37"/>
+        </w:numPr>
+        <w:rPr>
+          <w:sz w:val="28"/>
+          <w:szCs w:val="28"/>
+        </w:rPr>
+      </w:pPr>
+      <w:r>
+        <w:rPr>
+          <w:sz w:val="28"/>
+          <w:szCs w:val="28"/>
+        </w:rPr>
+        <w:t>Tablet → 2 columns</w:t>
+      </w:r>
+    </w:p>
+    <w:p>
+      <w:pPr>
+        <w:numPr>
+          <w:ilvl w:val="0"/>
+          <w:numId w:val="37"/>
+        </w:numPr>
+        <w:rPr>
+          <w:sz w:val="28"/>
+          <w:szCs w:val="28"/>
+        </w:rPr>
+      </w:pPr>
+      <w:r>
+        <w:rPr>
+          <w:sz w:val="28"/>
+          <w:szCs w:val="28"/>
+        </w:rPr>
+        <w:t>Laptop → 3 columns</w:t>
+      </w:r>
+    </w:p>
+    <w:p>
+      <w:pPr>
+        <w:rPr>
+          <w:sz w:val="28"/>
+          <w:szCs w:val="28"/>
+        </w:rPr>
+      </w:pPr>
+      <w:r>
+        <w:rPr>
+          <w:sz w:val="28"/>
+          <w:szCs w:val="28"/>
+        </w:rPr>
+        <w:pict w14:anchorId="51104CDC">
+          <v:rect id="_x0000_i1078" style="width:0;height:1.5pt" o:hralign="center" o:hrstd="t" o:hr="t" fillcolor="#a0a0a0" stroked="f"/>
+        </w:pict>
+      </w:r>
+    </w:p>
+    <w:p>
+      <w:pPr>
+        <w:rPr>
+          <w:b/>
+          <w:bCs/>
+          <w:sz w:val="28"/>
+          <w:szCs w:val="28"/>
+        </w:rPr>
+      </w:pPr>
+      <w:r>
+        <w:rPr>
+          <w:rFonts w:ascii="Segoe UI Emoji" w:hAnsi="Segoe UI Emoji" w:cs="Segoe UI Emoji"/>
+          <w:b/>
+          <w:bCs/>
+          <w:sz w:val="28"/>
+          <w:szCs w:val="28"/>
+        </w:rPr>
+        <w:t>💡</w:t>
+      </w:r>
+      <w:r>
+        <w:rPr>
+          <w:b/>
+          <w:bCs/>
+          <w:sz w:val="28"/>
+          <w:szCs w:val="28"/>
+        </w:rPr>
+        <w:t xml:space="preserve"> STEP 5: Responsive Padding, Margin, and Width</w:t>
+      </w:r>
+    </w:p>
+    <w:p>
+      <w:pPr>
+        <w:rPr>
+          <w:sz w:val="28"/>
+          <w:szCs w:val="28"/>
+        </w:rPr>
+      </w:pPr>
+      <w:r>
+        <w:rPr>
+          <w:sz w:val="28"/>
+          <w:szCs w:val="28"/>
+        </w:rPr>
+        <w:t>You can also change spacing or width with breakpoints.</w:t>
+      </w:r>
+    </w:p>
+    <w:p>
+      <w:pPr>
+        <w:rPr>
+          <w:b/>
+          <w:bCs/>
+          <w:sz w:val="28"/>
+          <w:szCs w:val="28"/>
+        </w:rPr>
+      </w:pPr>
+      <w:r>
+        <w:rPr>
+          <w:rFonts w:ascii="Segoe UI Emoji" w:hAnsi="Segoe UI Emoji" w:cs="Segoe UI Emoji"/>
+          <w:b/>
+          <w:bCs/>
+          <w:sz w:val="28"/>
+          <w:szCs w:val="28"/>
+        </w:rPr>
+        <w:t>🧩</w:t>
+      </w:r>
+      <w:r>
+        <w:rPr>
+          <w:b/>
+          <w:bCs/>
+          <w:sz w:val="28"/>
+          <w:szCs w:val="28"/>
+        </w:rPr>
+        <w:t xml:space="preserve"> Example 4 — Box width changes on screen size</w:t>
+      </w:r>
+    </w:p>
+    <w:p>
+      <w:pPr>
+        <w:rPr>
+          <w:sz w:val="28"/>
+          <w:szCs w:val="28"/>
+        </w:rPr>
+      </w:pPr>
+      <w:r>
+        <w:rPr>
+          <w:sz w:val="28"/>
+          <w:szCs w:val="28"/>
+        </w:rPr>
+        <w:t xml:space="preserve">&lt;div class="bg-purple-400 h-32 w-1/2 </w:t>
+      </w:r>
+      <w:proofErr w:type="gramStart"/>
+      <w:r>
+        <w:rPr>
+          <w:sz w:val="28"/>
+          <w:szCs w:val="28"/>
+        </w:rPr>
+        <w:t>sm:w</w:t>
+      </w:r>
+      <w:proofErr w:type="gramEnd"/>
+      <w:r>
+        <w:rPr>
+          <w:sz w:val="28"/>
+          <w:szCs w:val="28"/>
+        </w:rPr>
+        <w:t xml:space="preserve">-1/3 </w:t>
+      </w:r>
+      <w:proofErr w:type="gramStart"/>
+      <w:r>
+        <w:rPr>
+          <w:sz w:val="28"/>
+          <w:szCs w:val="28"/>
+        </w:rPr>
+        <w:t>md:w</w:t>
+      </w:r>
+      <w:proofErr w:type="gramEnd"/>
+      <w:r>
+        <w:rPr>
+          <w:sz w:val="28"/>
+          <w:szCs w:val="28"/>
+        </w:rPr>
+        <w:t xml:space="preserve">-1/4 </w:t>
+      </w:r>
+      <w:proofErr w:type="gramStart"/>
+      <w:r>
+        <w:rPr>
+          <w:sz w:val="28"/>
+          <w:szCs w:val="28"/>
+        </w:rPr>
+        <w:t>lg:w</w:t>
+      </w:r>
+      <w:proofErr w:type="gramEnd"/>
+      <w:r>
+        <w:rPr>
+          <w:sz w:val="28"/>
+          <w:szCs w:val="28"/>
+        </w:rPr>
+        <w:t>-1/5"&gt;&lt;/div&gt;</w:t>
+      </w:r>
+    </w:p>
+    <w:p>
+      <w:pPr>
+        <w:rPr>
+          <w:sz w:val="28"/>
+          <w:szCs w:val="28"/>
+        </w:rPr>
+      </w:pPr>
+      <w:r>
+        <w:rPr>
+          <w:rFonts w:ascii="Segoe UI Emoji" w:hAnsi="Segoe UI Emoji" w:cs="Segoe UI Emoji"/>
+          <w:sz w:val="28"/>
+          <w:szCs w:val="28"/>
+        </w:rPr>
+        <w:t>🧠</w:t>
+      </w:r>
+      <w:r>
+        <w:rPr>
+          <w:sz w:val="28"/>
+          <w:szCs w:val="28"/>
+        </w:rPr>
+        <w:t xml:space="preserve"> Explanation:</w:t>
+      </w:r>
+    </w:p>
+    <w:p>
+      <w:pPr>
+        <w:numPr>
+          <w:ilvl w:val="0"/>
+          <w:numId w:val="38"/>
+        </w:numPr>
+        <w:rPr>
+          <w:sz w:val="28"/>
+          <w:szCs w:val="28"/>
+        </w:rPr>
+      </w:pPr>
+      <w:r>
+        <w:rPr>
+          <w:sz w:val="28"/>
+          <w:szCs w:val="28"/>
+        </w:rPr>
+        <w:t>Default: 50% width</w:t>
+      </w:r>
+    </w:p>
+    <w:p>
+      <w:pPr>
+        <w:numPr>
+          <w:ilvl w:val="0"/>
+          <w:numId w:val="38"/>
+        </w:numPr>
+        <w:rPr>
+          <w:sz w:val="28"/>
+          <w:szCs w:val="28"/>
+        </w:rPr>
+      </w:pPr>
+      <w:proofErr w:type="spellStart"/>
+      <w:r>
+        <w:rPr>
+          <w:sz w:val="28"/>
+          <w:szCs w:val="28"/>
+        </w:rPr>
+        <w:t>sm</w:t>
+      </w:r>
+      <w:proofErr w:type="spellEnd"/>
+      <w:r>
+        <w:rPr>
+          <w:sz w:val="28"/>
+          <w:szCs w:val="28"/>
+        </w:rPr>
+        <w:t>: → 33%</w:t>
+      </w:r>
+    </w:p>
+    <w:p>
+      <w:pPr>
+        <w:numPr>
+          <w:ilvl w:val="0"/>
+          <w:numId w:val="38"/>
+        </w:numPr>
+        <w:rPr>
+          <w:sz w:val="28"/>
+          <w:szCs w:val="28"/>
+        </w:rPr>
+      </w:pPr>
+      <w:r>
+        <w:rPr>
+          <w:sz w:val="28"/>
+          <w:szCs w:val="28"/>
+        </w:rPr>
+        <w:t>md: → 25%</w:t>
+      </w:r>
+    </w:p>
+    <w:p>
+      <w:pPr>
+        <w:numPr>
+          <w:ilvl w:val="0"/>
+          <w:numId w:val="38"/>
+        </w:numPr>
+        <w:rPr>
+          <w:sz w:val="28"/>
+          <w:szCs w:val="28"/>
+        </w:rPr>
+      </w:pPr>
+      <w:r>
+        <w:rPr>
+          <w:sz w:val="28"/>
+          <w:szCs w:val="28"/>
+        </w:rPr>
+        <w:t>lg: → 20%</w:t>
+      </w:r>
+    </w:p>
+    <w:p>
+      <w:pPr>
+        <w:rPr>
+          <w:sz w:val="28"/>
+          <w:szCs w:val="28"/>
+        </w:rPr>
+      </w:pPr>
+      <w:r>
+        <w:rPr>
+          <w:rFonts w:ascii="Segoe UI Emoji" w:hAnsi="Segoe UI Emoji" w:cs="Segoe UI Emoji"/>
+          <w:sz w:val="28"/>
+          <w:szCs w:val="28"/>
+        </w:rPr>
+        <w:t>✅</w:t>
+      </w:r>
+      <w:r>
+        <w:rPr>
+          <w:sz w:val="28"/>
+          <w:szCs w:val="28"/>
+        </w:rPr>
+        <w:t xml:space="preserve"> The box keeps shrinking as screen grows.</w:t>
+      </w:r>
+    </w:p>
+    <w:p>
+      <w:pPr>
+        <w:rPr>
+          <w:sz w:val="28"/>
+          <w:szCs w:val="28"/>
+        </w:rPr>
+      </w:pPr>
+      <w:r>
+        <w:rPr>
+          <w:sz w:val="28"/>
+          <w:szCs w:val="28"/>
+        </w:rPr>
+        <w:lastRenderedPageBreak/>
+        <w:pict w14:anchorId="7961642B">
+          <v:rect id="_x0000_i1079" style="width:0;height:1.5pt" o:hralign="center" o:hrstd="t" o:hr="t" fillcolor="#a0a0a0" stroked="f"/>
+        </w:pict>
+      </w:r>
+    </w:p>
+    <w:p>
+      <w:pPr>
+        <w:rPr>
+          <w:b/>
+          <w:bCs/>
+          <w:sz w:val="28"/>
+          <w:szCs w:val="28"/>
+        </w:rPr>
+      </w:pPr>
+      <w:r>
+        <w:rPr>
+          <w:rFonts w:ascii="Segoe UI Symbol" w:hAnsi="Segoe UI Symbol" w:cs="Segoe UI Symbol"/>
+          <w:b/>
+          <w:bCs/>
+          <w:sz w:val="28"/>
+          <w:szCs w:val="28"/>
+        </w:rPr>
+        <w:t>🕶</w:t>
+      </w:r>
+      <w:r>
+        <w:rPr>
+          <w:b/>
+          <w:bCs/>
+          <w:sz w:val="28"/>
+          <w:szCs w:val="28"/>
+        </w:rPr>
+        <w:t xml:space="preserve"> STEP 6: Hide/Show Elements Responsively</w:t>
+      </w:r>
+    </w:p>
+    <w:p>
+      <w:pPr>
+        <w:rPr>
+          <w:sz w:val="28"/>
+          <w:szCs w:val="28"/>
+        </w:rPr>
+      </w:pPr>
+      <w:r>
+        <w:rPr>
+          <w:sz w:val="28"/>
+          <w:szCs w:val="28"/>
+        </w:rPr>
+        <w:t xml:space="preserve">&lt;p class="block </w:t>
+      </w:r>
+      <w:proofErr w:type="spellStart"/>
+      <w:proofErr w:type="gramStart"/>
+      <w:r>
+        <w:rPr>
+          <w:sz w:val="28"/>
+          <w:szCs w:val="28"/>
+        </w:rPr>
+        <w:t>md:hidden</w:t>
+      </w:r>
+      <w:proofErr w:type="spellEnd"/>
+      <w:proofErr w:type="gramEnd"/>
+      <w:r>
+        <w:rPr>
+          <w:sz w:val="28"/>
+          <w:szCs w:val="28"/>
+        </w:rPr>
+        <w:t xml:space="preserve">"&gt;I show only on mobile </w:t>
+      </w:r>
+      <w:r>
+        <w:rPr>
+          <w:rFonts w:ascii="Segoe UI Emoji" w:hAnsi="Segoe UI Emoji" w:cs="Segoe UI Emoji"/>
+          <w:sz w:val="28"/>
+          <w:szCs w:val="28"/>
+        </w:rPr>
+        <w:t>📱</w:t>
+      </w:r>
+      <w:r>
+        <w:rPr>
+          <w:sz w:val="28"/>
+          <w:szCs w:val="28"/>
+        </w:rPr>
+        <w:t>&lt;/p&gt;</w:t>
+      </w:r>
+    </w:p>
+    <w:p>
+      <w:pPr>
+        <w:rPr>
+          <w:sz w:val="28"/>
+          <w:szCs w:val="28"/>
+        </w:rPr>
+      </w:pPr>
+      <w:r>
+        <w:rPr>
+          <w:sz w:val="28"/>
+          <w:szCs w:val="28"/>
+        </w:rPr>
+        <w:t xml:space="preserve">&lt;p class="hidden </w:t>
+      </w:r>
+      <w:proofErr w:type="spellStart"/>
+      <w:proofErr w:type="gramStart"/>
+      <w:r>
+        <w:rPr>
+          <w:sz w:val="28"/>
+          <w:szCs w:val="28"/>
+        </w:rPr>
+        <w:t>md:block</w:t>
+      </w:r>
+      <w:proofErr w:type="spellEnd"/>
+      <w:proofErr w:type="gramEnd"/>
+      <w:r>
+        <w:rPr>
+          <w:sz w:val="28"/>
+          <w:szCs w:val="28"/>
+        </w:rPr>
+        <w:t xml:space="preserve">"&gt;I show only on desktop </w:t>
+      </w:r>
+      <w:r>
+        <w:rPr>
+          <w:rFonts w:ascii="Segoe UI Emoji" w:hAnsi="Segoe UI Emoji" w:cs="Segoe UI Emoji"/>
+          <w:sz w:val="28"/>
+          <w:szCs w:val="28"/>
+        </w:rPr>
+        <w:t>💻</w:t>
+      </w:r>
+      <w:r>
+        <w:rPr>
+          <w:sz w:val="28"/>
+          <w:szCs w:val="28"/>
+        </w:rPr>
+        <w:t>&lt;/p&gt;</w:t>
+      </w:r>
+    </w:p>
+    <w:p>
+      <w:pPr>
+        <w:rPr>
+          <w:sz w:val="28"/>
+          <w:szCs w:val="28"/>
+        </w:rPr>
+      </w:pPr>
+      <w:r>
+        <w:rPr>
+          <w:rFonts w:ascii="Segoe UI Emoji" w:hAnsi="Segoe UI Emoji" w:cs="Segoe UI Emoji"/>
+          <w:sz w:val="28"/>
+          <w:szCs w:val="28"/>
+        </w:rPr>
+        <w:t>🧠</w:t>
+      </w:r>
+      <w:r>
+        <w:rPr>
+          <w:sz w:val="28"/>
+          <w:szCs w:val="28"/>
+        </w:rPr>
+        <w:t xml:space="preserve"> hidden → hides element</w:t>
+      </w:r>
+      <w:r>
+        <w:rPr>
+          <w:sz w:val="28"/>
+          <w:szCs w:val="28"/>
+        </w:rPr>
+        <w:br/>
+      </w:r>
+      <w:r>
+        <w:rPr>
+          <w:rFonts w:ascii="Segoe UI Emoji" w:hAnsi="Segoe UI Emoji" w:cs="Segoe UI Emoji"/>
+          <w:sz w:val="28"/>
+          <w:szCs w:val="28"/>
+        </w:rPr>
+        <w:t>🧠</w:t>
+      </w:r>
+      <w:r>
+        <w:rPr>
+          <w:sz w:val="28"/>
+          <w:szCs w:val="28"/>
+        </w:rPr>
+        <w:t xml:space="preserve"> block → shows element</w:t>
+      </w:r>
+      <w:r>
+        <w:rPr>
+          <w:sz w:val="28"/>
+          <w:szCs w:val="28"/>
+        </w:rPr>
+        <w:br/>
+        <w:t>Combine them to toggle visibility by breakpoint.</w:t>
+      </w:r>
+    </w:p>
+    <w:p>
+      <w:pPr>
+        <w:rPr>
+          <w:sz w:val="28"/>
+          <w:szCs w:val="28"/>
+        </w:rPr>
+      </w:pPr>
+      <w:r>
+        <w:rPr>
+          <w:sz w:val="28"/>
+          <w:szCs w:val="28"/>
+        </w:rPr>
+        <w:pict w14:anchorId="284CB411">
+          <v:rect id="_x0000_i1080" style="width:0;height:1.5pt" o:hralign="center" o:hrstd="t" o:hr="t" fillcolor="#a0a0a0" stroked="f"/>
+        </w:pict>
+      </w:r>
+    </w:p>
+    <w:p>
+      <w:pPr>
+        <w:rPr>
+          <w:b/>
+          <w:bCs/>
+          <w:sz w:val="28"/>
+          <w:szCs w:val="28"/>
+        </w:rPr>
+      </w:pPr>
+      <w:r>
+        <w:rPr>
+          <w:rFonts w:ascii="Segoe UI Emoji" w:hAnsi="Segoe UI Emoji" w:cs="Segoe UI Emoji"/>
+          <w:b/>
+          <w:bCs/>
+          <w:sz w:val="28"/>
+          <w:szCs w:val="28"/>
+        </w:rPr>
+        <w:t>🧭</w:t>
+      </w:r>
+      <w:r>
+        <w:rPr>
+          <w:b/>
+          <w:bCs/>
+          <w:sz w:val="28"/>
+          <w:szCs w:val="28"/>
+        </w:rPr>
+        <w:t xml:space="preserve"> STEP 7: Responsive Navbar (Mini Project)</w:t>
+      </w:r>
+    </w:p>
+    <w:p>
+      <w:pPr>
+        <w:rPr>
+          <w:sz w:val="28"/>
+          <w:szCs w:val="28"/>
+        </w:rPr>
+      </w:pPr>
+      <w:r>
+        <w:rPr>
+          <w:sz w:val="28"/>
+          <w:szCs w:val="28"/>
+        </w:rPr>
+        <w:t xml:space="preserve">Let’s make a small example next to </w:t>
+      </w:r>
+      <w:r>
+        <w:rPr>
+          <w:i/>
+          <w:iCs/>
+          <w:sz w:val="28"/>
+          <w:szCs w:val="28"/>
+        </w:rPr>
+        <w:t>practice everything</w:t>
+      </w:r>
+      <w:r>
+        <w:rPr>
+          <w:sz w:val="28"/>
+          <w:szCs w:val="28"/>
+        </w:rPr>
+        <w:t>:</w:t>
+      </w:r>
+    </w:p>
+    <w:p>
+      <w:pPr>
+        <w:numPr>
+          <w:ilvl w:val="0"/>
+          <w:numId w:val="39"/>
+        </w:numPr>
+        <w:rPr>
+          <w:sz w:val="28"/>
+          <w:szCs w:val="28"/>
+        </w:rPr>
+      </w:pPr>
+      <w:r>
+        <w:rPr>
+          <w:sz w:val="28"/>
+          <w:szCs w:val="28"/>
+        </w:rPr>
+        <w:t>Mobile: hamburger menu</w:t>
+      </w:r>
+    </w:p>
+    <w:p>
+      <w:pPr>
+        <w:numPr>
+          <w:ilvl w:val="0"/>
+          <w:numId w:val="39"/>
+        </w:numPr>
+        <w:rPr>
+          <w:sz w:val="28"/>
+          <w:szCs w:val="28"/>
+        </w:rPr>
+      </w:pPr>
+      <w:r>
+        <w:rPr>
+          <w:sz w:val="28"/>
+          <w:szCs w:val="28"/>
+        </w:rPr>
+        <w:t>Desktop: horizontal menu</w:t>
+      </w:r>
+    </w:p>
+    <w:p>
+      <w:pPr>
+        <w:rPr>
+          <w:sz w:val="28"/>
+          <w:szCs w:val="28"/>
+        </w:rPr>
+      </w:pPr>
+      <w:r>
+        <w:rPr>
+          <w:sz w:val="28"/>
+          <w:szCs w:val="28"/>
+        </w:rPr>
+        <w:t xml:space="preserve">Would you like me to </w:t>
+      </w:r>
+      <w:r>
+        <w:rPr>
+          <w:b/>
+          <w:bCs/>
+          <w:sz w:val="28"/>
+          <w:szCs w:val="28"/>
+        </w:rPr>
+        <w:t>start building that Navbar step-by-step</w:t>
+      </w:r>
+      <w:r>
+        <w:rPr>
+          <w:sz w:val="28"/>
+          <w:szCs w:val="28"/>
+        </w:rPr>
+        <w:t xml:space="preserve"> next (with explanations for each class)?</w:t>
+      </w:r>
+    </w:p>
+    <w:p>
+      <w:pPr>
+        <w:rPr>
+          <w:sz w:val="28"/>
+          <w:szCs w:val="28"/>
+        </w:rPr>
+      </w:pPr>
+      <w:r>
+        <w:rPr>
+          <w:sz w:val="28"/>
+          <w:szCs w:val="28"/>
+        </w:rPr>
+        <w:t>It will teach you:</w:t>
+      </w:r>
+    </w:p>
+    <w:p>
+      <w:pPr>
+        <w:numPr>
+          <w:ilvl w:val="0"/>
+          <w:numId w:val="40"/>
+        </w:numPr>
+        <w:rPr>
+          <w:sz w:val="28"/>
+          <w:szCs w:val="28"/>
+        </w:rPr>
+      </w:pPr>
+      <w:r>
+        <w:rPr>
+          <w:sz w:val="28"/>
+          <w:szCs w:val="28"/>
+        </w:rPr>
+        <w:t>flex + responsive direction</w:t>
+      </w:r>
+    </w:p>
+    <w:p>
+      <w:pPr>
+        <w:numPr>
+          <w:ilvl w:val="0"/>
+          <w:numId w:val="40"/>
+        </w:numPr>
+        <w:rPr>
+          <w:sz w:val="28"/>
+          <w:szCs w:val="28"/>
+        </w:rPr>
+      </w:pPr>
+      <w:r>
+        <w:rPr>
+          <w:sz w:val="28"/>
+          <w:szCs w:val="28"/>
+        </w:rPr>
+        <w:t>justify-between, items-center</w:t>
+      </w:r>
+    </w:p>
+    <w:p>
+      <w:pPr>
+        <w:numPr>
+          <w:ilvl w:val="0"/>
+          <w:numId w:val="40"/>
+        </w:numPr>
+        <w:rPr>
+          <w:sz w:val="28"/>
+          <w:szCs w:val="28"/>
+        </w:rPr>
+      </w:pPr>
+      <w:r>
+        <w:rPr>
+          <w:sz w:val="28"/>
+          <w:szCs w:val="28"/>
+        </w:rPr>
+        <w:t>hidden / block responsive toggle</w:t>
+      </w:r>
+    </w:p>
+    <w:p>
+      <w:pPr>
+        <w:numPr>
+          <w:ilvl w:val="0"/>
+          <w:numId w:val="40"/>
+        </w:numPr>
+        <w:rPr>
+          <w:sz w:val="28"/>
+          <w:szCs w:val="28"/>
+        </w:rPr>
+      </w:pPr>
+      <w:r>
+        <w:rPr>
+          <w:sz w:val="28"/>
+          <w:szCs w:val="28"/>
+        </w:rPr>
+        <w:t>Spacing and alignment in Tailwind</w:t>
+      </w:r>
+    </w:p>
+    <w:p>
+      <w:pPr>
+        <w:rPr>
+          <w:sz w:val="28"/>
+          <w:szCs w:val="28"/>
+        </w:rPr>
+      </w:pPr>
+      <w:r>
+        <w:rPr>
+          <w:rFonts w:ascii="Segoe UI Emoji" w:hAnsi="Segoe UI Emoji" w:cs="Segoe UI Emoji"/>
+          <w:sz w:val="28"/>
+          <w:szCs w:val="28"/>
+        </w:rPr>
+        <w:t>👉</w:t>
+      </w:r>
+      <w:r>
+        <w:rPr>
+          <w:sz w:val="28"/>
+          <w:szCs w:val="28"/>
+        </w:rPr>
+        <w:t xml:space="preserve"> Say “yes” and I’ll start with the </w:t>
+      </w:r>
+      <w:r>
+        <w:rPr>
+          <w:b/>
+          <w:bCs/>
+          <w:sz w:val="28"/>
+          <w:szCs w:val="28"/>
+        </w:rPr>
+        <w:t>mobile-first navbar</w:t>
+      </w:r>
+      <w:r>
+        <w:rPr>
+          <w:sz w:val="28"/>
+          <w:szCs w:val="28"/>
+        </w:rPr>
+        <w:t xml:space="preserve"> and grow it to full desktop version step-by-step.</w:t>
+      </w:r>
+    </w:p>
+    <w:p>
+      <w:pPr>
+        <w:rPr>
+          <w:sz w:val="28"/>
+          <w:szCs w:val="28"/>
+        </w:rPr>
+      </w:pPr>
+    </w:p>
+    <w:p>
+      <w:pPr>
         <w:ind w:left="720"/>
         <w:rPr>
           <w:sz w:val="28"/>
@@ -11223,6 +14159,155 @@
 <file path=word/numbering.xml><?xml version="1.0" encoding="utf-8"?>
 <w:numbering xmlns:wpc="http://schemas.microsoft.com/office/word/2010/wordprocessingCanvas" xmlns:cx="http://schemas.microsoft.com/office/drawing/2014/chartex" xmlns:cx1="http://schemas.microsoft.com/office/drawing/2015/9/8/chartex" xmlns:cx2="http://schemas.microsoft.com/office/drawing/2015/10/21/chartex" xmlns:cx3="http://schemas.microsoft.com/office/drawing/2016/5/9/chartex" xmlns:cx4="http://schemas.microsoft.com/office/drawing/2016/5/10/chartex" xmlns:cx5="http://schemas.microsoft.com/office/drawing/2016/5/11/chartex" xmlns:cx6="http://schemas.microsoft.com/office/drawing/2016/5/12/chartex" xmlns:cx7="http://schemas.microsoft.com/office/drawing/2016/5/13/chartex" xmlns:cx8="http://schemas.microsoft.com/office/drawing/2016/5/14/chartex" xmlns:mc="http://schemas.openxmlformats.org/markup-compatibility/2006" xmlns:aink="http://schemas.microsoft.com/office/drawing/2016/ink" xmlns:am3d="http://schemas.microsoft.com/office/drawing/2017/model3d" xmlns:o="urn:schemas-microsoft-com:office:office" xmlns:oel="http://schemas.microsoft.com/office/2019/extlst" xmlns:r="http://schemas.openxmlformats.org/officeDocument/2006/relationships" xmlns:m="http://schemas.openxmlformats.org/officeDocument/2006/math" xmlns:v="urn:schemas-microsoft-com:vml" xmlns:wp14="http://schemas.microsoft.com/office/word/2010/wordprocessingDrawing" xmlns:wp="http://schemas.openxmlformats.org/drawingml/2006/wordprocessingDrawing" xmlns:w10="urn:schemas-microsoft-com:office:word" xmlns:w="http://schemas.openxmlformats.org/wordprocessingml/2006/main" xmlns:w14="http://schemas.microsoft.com/office/word/2010/wordml" xmlns:w15="http://schemas.microsoft.com/office/word/2012/wordml" xmlns:w16cex="http://schemas.microsoft.com/office/word/2018/wordml/cex" xmlns:w16cid="http://schemas.microsoft.com/office/word/2016/wordml/cid" xmlns:w16="http://schemas.microsoft.com/office/word/2018/wordml" xmlns:w16du="http://schemas.microsoft.com/office/word/2023/wordml/word16du" xmlns:w16sdtdh="http://schemas.microsoft.com/office/word/2020/wordml/sdtdatahash" xmlns:w16sdtfl="http://schemas.microsoft.com/office/word/2024/wordml/sdtformatlock" xmlns:w16se="http://schemas.microsoft.com/office/word/2015/wordml/symex" xmlns:wpg="http://schemas.microsoft.com/office/word/2010/wordprocessingGroup" xmlns:wpi="http://schemas.microsoft.com/office/word/2010/wordprocessingInk" xmlns:wne="http://schemas.microsoft.com/office/word/2006/wordml" xmlns:wps="http://schemas.microsoft.com/office/word/2010/wordprocessingShape" mc:Ignorable="w14 w15 w16se w16cid w16 w16cex w16sdtdh w16sdtfl w16du wp14">
   <w:abstractNum w:abstractNumId="0" w15:restartNumberingAfterBreak="0">
+    <w:nsid w:val="00D81F7E"/>
+    <w:multiLevelType w:val="multilevel"/>
+    <w:tmpl w:val="AE3A9CDC"/>
+    <w:lvl w:ilvl="0">
+      <w:start w:val="1"/>
+      <w:numFmt w:val="bullet"/>
+      <w:lvlText w:val=""/>
+      <w:lvlJc w:val="left"/>
+      <w:pPr>
+        <w:tabs>
+          <w:tab w:val="num" w:pos="720"/>
+        </w:tabs>
+        <w:ind w:left="720" w:hanging="360"/>
+      </w:pPr>
+      <w:rPr>
+        <w:rFonts w:ascii="Symbol" w:hAnsi="Symbol" w:hint="default"/>
+        <w:sz w:val="20"/>
+      </w:rPr>
+    </w:lvl>
+    <w:lvl w:ilvl="1" w:tentative="1">
+      <w:start w:val="1"/>
+      <w:numFmt w:val="bullet"/>
+      <w:lvlText w:val="o"/>
+      <w:lvlJc w:val="left"/>
+      <w:pPr>
+        <w:tabs>
+          <w:tab w:val="num" w:pos="1440"/>
+        </w:tabs>
+        <w:ind w:left="1440" w:hanging="360"/>
+      </w:pPr>
+      <w:rPr>
+        <w:rFonts w:ascii="Courier New" w:hAnsi="Courier New" w:hint="default"/>
+        <w:sz w:val="20"/>
+      </w:rPr>
+    </w:lvl>
+    <w:lvl w:ilvl="2" w:tentative="1">
+      <w:start w:val="1"/>
+      <w:numFmt w:val="bullet"/>
+      <w:lvlText w:val=""/>
+      <w:lvlJc w:val="left"/>
+      <w:pPr>
+        <w:tabs>
+          <w:tab w:val="num" w:pos="2160"/>
+        </w:tabs>
+        <w:ind w:left="2160" w:hanging="360"/>
+      </w:pPr>
+      <w:rPr>
+        <w:rFonts w:ascii="Wingdings" w:hAnsi="Wingdings" w:hint="default"/>
+        <w:sz w:val="20"/>
+      </w:rPr>
+    </w:lvl>
+    <w:lvl w:ilvl="3" w:tentative="1">
+      <w:start w:val="1"/>
+      <w:numFmt w:val="bullet"/>
+      <w:lvlText w:val=""/>
+      <w:lvlJc w:val="left"/>
+      <w:pPr>
+        <w:tabs>
+          <w:tab w:val="num" w:pos="2880"/>
+        </w:tabs>
+        <w:ind w:left="2880" w:hanging="360"/>
+      </w:pPr>
+      <w:rPr>
+        <w:rFonts w:ascii="Wingdings" w:hAnsi="Wingdings" w:hint="default"/>
+        <w:sz w:val="20"/>
+      </w:rPr>
+    </w:lvl>
+    <w:lvl w:ilvl="4" w:tentative="1">
+      <w:start w:val="1"/>
+      <w:numFmt w:val="bullet"/>
+      <w:lvlText w:val=""/>
+      <w:lvlJc w:val="left"/>
+      <w:pPr>
+        <w:tabs>
+          <w:tab w:val="num" w:pos="3600"/>
+        </w:tabs>
+        <w:ind w:left="3600" w:hanging="360"/>
+      </w:pPr>
+      <w:rPr>
+        <w:rFonts w:ascii="Wingdings" w:hAnsi="Wingdings" w:hint="default"/>
+        <w:sz w:val="20"/>
+      </w:rPr>
+    </w:lvl>
+    <w:lvl w:ilvl="5" w:tentative="1">
+      <w:start w:val="1"/>
+      <w:numFmt w:val="bullet"/>
+      <w:lvlText w:val=""/>
+      <w:lvlJc w:val="left"/>
+      <w:pPr>
+        <w:tabs>
+          <w:tab w:val="num" w:pos="4320"/>
+        </w:tabs>
+        <w:ind w:left="4320" w:hanging="360"/>
+      </w:pPr>
+      <w:rPr>
+        <w:rFonts w:ascii="Wingdings" w:hAnsi="Wingdings" w:hint="default"/>
+        <w:sz w:val="20"/>
+      </w:rPr>
+    </w:lvl>
+    <w:lvl w:ilvl="6" w:tentative="1">
+      <w:start w:val="1"/>
+      <w:numFmt w:val="bullet"/>
+      <w:lvlText w:val=""/>
+      <w:lvlJc w:val="left"/>
+      <w:pPr>
+        <w:tabs>
+          <w:tab w:val="num" w:pos="5040"/>
+        </w:tabs>
+        <w:ind w:left="5040" w:hanging="360"/>
+      </w:pPr>
+      <w:rPr>
+        <w:rFonts w:ascii="Wingdings" w:hAnsi="Wingdings" w:hint="default"/>
+        <w:sz w:val="20"/>
+      </w:rPr>
+    </w:lvl>
+    <w:lvl w:ilvl="7" w:tentative="1">
+      <w:start w:val="1"/>
+      <w:numFmt w:val="bullet"/>
+      <w:lvlText w:val=""/>
+      <w:lvlJc w:val="left"/>
+      <w:pPr>
+        <w:tabs>
+          <w:tab w:val="num" w:pos="5760"/>
+        </w:tabs>
+        <w:ind w:left="5760" w:hanging="360"/>
+      </w:pPr>
+      <w:rPr>
+        <w:rFonts w:ascii="Wingdings" w:hAnsi="Wingdings" w:hint="default"/>
+        <w:sz w:val="20"/>
+      </w:rPr>
+    </w:lvl>
+    <w:lvl w:ilvl="8" w:tentative="1">
+      <w:start w:val="1"/>
+      <w:numFmt w:val="bullet"/>
+      <w:lvlText w:val=""/>
+      <w:lvlJc w:val="left"/>
+      <w:pPr>
+        <w:tabs>
+          <w:tab w:val="num" w:pos="6480"/>
+        </w:tabs>
+        <w:ind w:left="6480" w:hanging="360"/>
+      </w:pPr>
+      <w:rPr>
+        <w:rFonts w:ascii="Wingdings" w:hAnsi="Wingdings" w:hint="default"/>
+        <w:sz w:val="20"/>
+      </w:rPr>
+    </w:lvl>
+  </w:abstractNum>
+  <w:abstractNum w:abstractNumId="1" w15:restartNumberingAfterBreak="0">
     <w:nsid w:val="042B0C47"/>
     <w:multiLevelType w:val="multilevel"/>
     <w:tmpl w:val="4D705954"/>
@@ -11371,7 +14456,7 @@
       </w:rPr>
     </w:lvl>
   </w:abstractNum>
-  <w:abstractNum w:abstractNumId="1" w15:restartNumberingAfterBreak="0">
+  <w:abstractNum w:abstractNumId="2" w15:restartNumberingAfterBreak="0">
     <w:nsid w:val="065175E9"/>
     <w:multiLevelType w:val="multilevel"/>
     <w:tmpl w:val="6B96D9A2"/>
@@ -11520,7 +14605,156 @@
       </w:rPr>
     </w:lvl>
   </w:abstractNum>
-  <w:abstractNum w:abstractNumId="2" w15:restartNumberingAfterBreak="0">
+  <w:abstractNum w:abstractNumId="3" w15:restartNumberingAfterBreak="0">
+    <w:nsid w:val="0A5D4006"/>
+    <w:multiLevelType w:val="multilevel"/>
+    <w:tmpl w:val="E392FE78"/>
+    <w:lvl w:ilvl="0">
+      <w:start w:val="1"/>
+      <w:numFmt w:val="bullet"/>
+      <w:lvlText w:val=""/>
+      <w:lvlJc w:val="left"/>
+      <w:pPr>
+        <w:tabs>
+          <w:tab w:val="num" w:pos="720"/>
+        </w:tabs>
+        <w:ind w:left="720" w:hanging="360"/>
+      </w:pPr>
+      <w:rPr>
+        <w:rFonts w:ascii="Symbol" w:hAnsi="Symbol" w:hint="default"/>
+        <w:sz w:val="20"/>
+      </w:rPr>
+    </w:lvl>
+    <w:lvl w:ilvl="1" w:tentative="1">
+      <w:start w:val="1"/>
+      <w:numFmt w:val="bullet"/>
+      <w:lvlText w:val="o"/>
+      <w:lvlJc w:val="left"/>
+      <w:pPr>
+        <w:tabs>
+          <w:tab w:val="num" w:pos="1440"/>
+        </w:tabs>
+        <w:ind w:left="1440" w:hanging="360"/>
+      </w:pPr>
+      <w:rPr>
+        <w:rFonts w:ascii="Courier New" w:hAnsi="Courier New" w:hint="default"/>
+        <w:sz w:val="20"/>
+      </w:rPr>
+    </w:lvl>
+    <w:lvl w:ilvl="2" w:tentative="1">
+      <w:start w:val="1"/>
+      <w:numFmt w:val="bullet"/>
+      <w:lvlText w:val=""/>
+      <w:lvlJc w:val="left"/>
+      <w:pPr>
+        <w:tabs>
+          <w:tab w:val="num" w:pos="2160"/>
+        </w:tabs>
+        <w:ind w:left="2160" w:hanging="360"/>
+      </w:pPr>
+      <w:rPr>
+        <w:rFonts w:ascii="Wingdings" w:hAnsi="Wingdings" w:hint="default"/>
+        <w:sz w:val="20"/>
+      </w:rPr>
+    </w:lvl>
+    <w:lvl w:ilvl="3" w:tentative="1">
+      <w:start w:val="1"/>
+      <w:numFmt w:val="bullet"/>
+      <w:lvlText w:val=""/>
+      <w:lvlJc w:val="left"/>
+      <w:pPr>
+        <w:tabs>
+          <w:tab w:val="num" w:pos="2880"/>
+        </w:tabs>
+        <w:ind w:left="2880" w:hanging="360"/>
+      </w:pPr>
+      <w:rPr>
+        <w:rFonts w:ascii="Wingdings" w:hAnsi="Wingdings" w:hint="default"/>
+        <w:sz w:val="20"/>
+      </w:rPr>
+    </w:lvl>
+    <w:lvl w:ilvl="4" w:tentative="1">
+      <w:start w:val="1"/>
+      <w:numFmt w:val="bullet"/>
+      <w:lvlText w:val=""/>
+      <w:lvlJc w:val="left"/>
+      <w:pPr>
+        <w:tabs>
+          <w:tab w:val="num" w:pos="3600"/>
+        </w:tabs>
+        <w:ind w:left="3600" w:hanging="360"/>
+      </w:pPr>
+      <w:rPr>
+        <w:rFonts w:ascii="Wingdings" w:hAnsi="Wingdings" w:hint="default"/>
+        <w:sz w:val="20"/>
+      </w:rPr>
+    </w:lvl>
+    <w:lvl w:ilvl="5" w:tentative="1">
+      <w:start w:val="1"/>
+      <w:numFmt w:val="bullet"/>
+      <w:lvlText w:val=""/>
+      <w:lvlJc w:val="left"/>
+      <w:pPr>
+        <w:tabs>
+          <w:tab w:val="num" w:pos="4320"/>
+        </w:tabs>
+        <w:ind w:left="4320" w:hanging="360"/>
+      </w:pPr>
+      <w:rPr>
+        <w:rFonts w:ascii="Wingdings" w:hAnsi="Wingdings" w:hint="default"/>
+        <w:sz w:val="20"/>
+      </w:rPr>
+    </w:lvl>
+    <w:lvl w:ilvl="6" w:tentative="1">
+      <w:start w:val="1"/>
+      <w:numFmt w:val="bullet"/>
+      <w:lvlText w:val=""/>
+      <w:lvlJc w:val="left"/>
+      <w:pPr>
+        <w:tabs>
+          <w:tab w:val="num" w:pos="5040"/>
+        </w:tabs>
+        <w:ind w:left="5040" w:hanging="360"/>
+      </w:pPr>
+      <w:rPr>
+        <w:rFonts w:ascii="Wingdings" w:hAnsi="Wingdings" w:hint="default"/>
+        <w:sz w:val="20"/>
+      </w:rPr>
+    </w:lvl>
+    <w:lvl w:ilvl="7" w:tentative="1">
+      <w:start w:val="1"/>
+      <w:numFmt w:val="bullet"/>
+      <w:lvlText w:val=""/>
+      <w:lvlJc w:val="left"/>
+      <w:pPr>
+        <w:tabs>
+          <w:tab w:val="num" w:pos="5760"/>
+        </w:tabs>
+        <w:ind w:left="5760" w:hanging="360"/>
+      </w:pPr>
+      <w:rPr>
+        <w:rFonts w:ascii="Wingdings" w:hAnsi="Wingdings" w:hint="default"/>
+        <w:sz w:val="20"/>
+      </w:rPr>
+    </w:lvl>
+    <w:lvl w:ilvl="8" w:tentative="1">
+      <w:start w:val="1"/>
+      <w:numFmt w:val="bullet"/>
+      <w:lvlText w:val=""/>
+      <w:lvlJc w:val="left"/>
+      <w:pPr>
+        <w:tabs>
+          <w:tab w:val="num" w:pos="6480"/>
+        </w:tabs>
+        <w:ind w:left="6480" w:hanging="360"/>
+      </w:pPr>
+      <w:rPr>
+        <w:rFonts w:ascii="Wingdings" w:hAnsi="Wingdings" w:hint="default"/>
+        <w:sz w:val="20"/>
+      </w:rPr>
+    </w:lvl>
+  </w:abstractNum>
+  <w:abstractNum w:abstractNumId="4" w15:restartNumberingAfterBreak="0">
     <w:nsid w:val="0CB9583A"/>
     <w:multiLevelType w:val="multilevel"/>
     <w:tmpl w:val="01DCD730"/>
@@ -11669,7 +14903,7 @@
       </w:rPr>
     </w:lvl>
   </w:abstractNum>
-  <w:abstractNum w:abstractNumId="3" w15:restartNumberingAfterBreak="0">
+  <w:abstractNum w:abstractNumId="5" w15:restartNumberingAfterBreak="0">
     <w:nsid w:val="0DC32A4E"/>
     <w:multiLevelType w:val="multilevel"/>
     <w:tmpl w:val="5346F528"/>
@@ -11818,7 +15052,7 @@
       </w:rPr>
     </w:lvl>
   </w:abstractNum>
-  <w:abstractNum w:abstractNumId="4" w15:restartNumberingAfterBreak="0">
+  <w:abstractNum w:abstractNumId="6" w15:restartNumberingAfterBreak="0">
     <w:nsid w:val="14B47F8B"/>
     <w:multiLevelType w:val="multilevel"/>
     <w:tmpl w:val="AF3E8054"/>
@@ -11967,7 +15201,156 @@
       </w:rPr>
     </w:lvl>
   </w:abstractNum>
-  <w:abstractNum w:abstractNumId="5" w15:restartNumberingAfterBreak="0">
+  <w:abstractNum w:abstractNumId="7" w15:restartNumberingAfterBreak="0">
+    <w:nsid w:val="1F303D2A"/>
+    <w:multiLevelType w:val="multilevel"/>
+    <w:tmpl w:val="54CC78C4"/>
+    <w:lvl w:ilvl="0">
+      <w:start w:val="1"/>
+      <w:numFmt w:val="bullet"/>
+      <w:lvlText w:val=""/>
+      <w:lvlJc w:val="left"/>
+      <w:pPr>
+        <w:tabs>
+          <w:tab w:val="num" w:pos="720"/>
+        </w:tabs>
+        <w:ind w:left="720" w:hanging="360"/>
+      </w:pPr>
+      <w:rPr>
+        <w:rFonts w:ascii="Symbol" w:hAnsi="Symbol" w:hint="default"/>
+        <w:sz w:val="20"/>
+      </w:rPr>
+    </w:lvl>
+    <w:lvl w:ilvl="1" w:tentative="1">
+      <w:start w:val="1"/>
+      <w:numFmt w:val="bullet"/>
+      <w:lvlText w:val="o"/>
+      <w:lvlJc w:val="left"/>
+      <w:pPr>
+        <w:tabs>
+          <w:tab w:val="num" w:pos="1440"/>
+        </w:tabs>
+        <w:ind w:left="1440" w:hanging="360"/>
+      </w:pPr>
+      <w:rPr>
+        <w:rFonts w:ascii="Courier New" w:hAnsi="Courier New" w:hint="default"/>
+        <w:sz w:val="20"/>
+      </w:rPr>
+    </w:lvl>
+    <w:lvl w:ilvl="2" w:tentative="1">
+      <w:start w:val="1"/>
+      <w:numFmt w:val="bullet"/>
+      <w:lvlText w:val=""/>
+      <w:lvlJc w:val="left"/>
+      <w:pPr>
+        <w:tabs>
+          <w:tab w:val="num" w:pos="2160"/>
+        </w:tabs>
+        <w:ind w:left="2160" w:hanging="360"/>
+      </w:pPr>
+      <w:rPr>
+        <w:rFonts w:ascii="Wingdings" w:hAnsi="Wingdings" w:hint="default"/>
+        <w:sz w:val="20"/>
+      </w:rPr>
+    </w:lvl>
+    <w:lvl w:ilvl="3" w:tentative="1">
+      <w:start w:val="1"/>
+      <w:numFmt w:val="bullet"/>
+      <w:lvlText w:val=""/>
+      <w:lvlJc w:val="left"/>
+      <w:pPr>
+        <w:tabs>
+          <w:tab w:val="num" w:pos="2880"/>
+        </w:tabs>
+        <w:ind w:left="2880" w:hanging="360"/>
+      </w:pPr>
+      <w:rPr>
+        <w:rFonts w:ascii="Wingdings" w:hAnsi="Wingdings" w:hint="default"/>
+        <w:sz w:val="20"/>
+      </w:rPr>
+    </w:lvl>
+    <w:lvl w:ilvl="4" w:tentative="1">
+      <w:start w:val="1"/>
+      <w:numFmt w:val="bullet"/>
+      <w:lvlText w:val=""/>
+      <w:lvlJc w:val="left"/>
+      <w:pPr>
+        <w:tabs>
+          <w:tab w:val="num" w:pos="3600"/>
+        </w:tabs>
+        <w:ind w:left="3600" w:hanging="360"/>
+      </w:pPr>
+      <w:rPr>
+        <w:rFonts w:ascii="Wingdings" w:hAnsi="Wingdings" w:hint="default"/>
+        <w:sz w:val="20"/>
+      </w:rPr>
+    </w:lvl>
+    <w:lvl w:ilvl="5" w:tentative="1">
+      <w:start w:val="1"/>
+      <w:numFmt w:val="bullet"/>
+      <w:lvlText w:val=""/>
+      <w:lvlJc w:val="left"/>
+      <w:pPr>
+        <w:tabs>
+          <w:tab w:val="num" w:pos="4320"/>
+        </w:tabs>
+        <w:ind w:left="4320" w:hanging="360"/>
+      </w:pPr>
+      <w:rPr>
+        <w:rFonts w:ascii="Wingdings" w:hAnsi="Wingdings" w:hint="default"/>
+        <w:sz w:val="20"/>
+      </w:rPr>
+    </w:lvl>
+    <w:lvl w:ilvl="6" w:tentative="1">
+      <w:start w:val="1"/>
+      <w:numFmt w:val="bullet"/>
+      <w:lvlText w:val=""/>
+      <w:lvlJc w:val="left"/>
+      <w:pPr>
+        <w:tabs>
+          <w:tab w:val="num" w:pos="5040"/>
+        </w:tabs>
+        <w:ind w:left="5040" w:hanging="360"/>
+      </w:pPr>
+      <w:rPr>
+        <w:rFonts w:ascii="Wingdings" w:hAnsi="Wingdings" w:hint="default"/>
+        <w:sz w:val="20"/>
+      </w:rPr>
+    </w:lvl>
+    <w:lvl w:ilvl="7" w:tentative="1">
+      <w:start w:val="1"/>
+      <w:numFmt w:val="bullet"/>
+      <w:lvlText w:val=""/>
+      <w:lvlJc w:val="left"/>
+      <w:pPr>
+        <w:tabs>
+          <w:tab w:val="num" w:pos="5760"/>
+        </w:tabs>
+        <w:ind w:left="5760" w:hanging="360"/>
+      </w:pPr>
+      <w:rPr>
+        <w:rFonts w:ascii="Wingdings" w:hAnsi="Wingdings" w:hint="default"/>
+        <w:sz w:val="20"/>
+      </w:rPr>
+    </w:lvl>
+    <w:lvl w:ilvl="8" w:tentative="1">
+      <w:start w:val="1"/>
+      <w:numFmt w:val="bullet"/>
+      <w:lvlText w:val=""/>
+      <w:lvlJc w:val="left"/>
+      <w:pPr>
+        <w:tabs>
+          <w:tab w:val="num" w:pos="6480"/>
+        </w:tabs>
+        <w:ind w:left="6480" w:hanging="360"/>
+      </w:pPr>
+      <w:rPr>
+        <w:rFonts w:ascii="Wingdings" w:hAnsi="Wingdings" w:hint="default"/>
+        <w:sz w:val="20"/>
+      </w:rPr>
+    </w:lvl>
+  </w:abstractNum>
+  <w:abstractNum w:abstractNumId="8" w15:restartNumberingAfterBreak="0">
     <w:nsid w:val="1FFD6AF8"/>
     <w:multiLevelType w:val="multilevel"/>
     <w:tmpl w:val="035C4EDA"/>
@@ -12116,7 +15499,7 @@
       </w:rPr>
     </w:lvl>
   </w:abstractNum>
-  <w:abstractNum w:abstractNumId="6" w15:restartNumberingAfterBreak="0">
+  <w:abstractNum w:abstractNumId="9" w15:restartNumberingAfterBreak="0">
     <w:nsid w:val="200F1A41"/>
     <w:multiLevelType w:val="multilevel"/>
     <w:tmpl w:val="D0E8ECB2"/>
@@ -12265,7 +15648,7 @@
       </w:rPr>
     </w:lvl>
   </w:abstractNum>
-  <w:abstractNum w:abstractNumId="7" w15:restartNumberingAfterBreak="0">
+  <w:abstractNum w:abstractNumId="10" w15:restartNumberingAfterBreak="0">
     <w:nsid w:val="21225041"/>
     <w:multiLevelType w:val="multilevel"/>
     <w:tmpl w:val="0198818A"/>
@@ -12414,7 +15797,156 @@
       </w:rPr>
     </w:lvl>
   </w:abstractNum>
-  <w:abstractNum w:abstractNumId="8" w15:restartNumberingAfterBreak="0">
+  <w:abstractNum w:abstractNumId="11" w15:restartNumberingAfterBreak="0">
+    <w:nsid w:val="367904AE"/>
+    <w:multiLevelType w:val="multilevel"/>
+    <w:tmpl w:val="5DC857C6"/>
+    <w:lvl w:ilvl="0">
+      <w:start w:val="1"/>
+      <w:numFmt w:val="bullet"/>
+      <w:lvlText w:val=""/>
+      <w:lvlJc w:val="left"/>
+      <w:pPr>
+        <w:tabs>
+          <w:tab w:val="num" w:pos="720"/>
+        </w:tabs>
+        <w:ind w:left="720" w:hanging="360"/>
+      </w:pPr>
+      <w:rPr>
+        <w:rFonts w:ascii="Symbol" w:hAnsi="Symbol" w:hint="default"/>
+        <w:sz w:val="20"/>
+      </w:rPr>
+    </w:lvl>
+    <w:lvl w:ilvl="1" w:tentative="1">
+      <w:start w:val="1"/>
+      <w:numFmt w:val="bullet"/>
+      <w:lvlText w:val="o"/>
+      <w:lvlJc w:val="left"/>
+      <w:pPr>
+        <w:tabs>
+          <w:tab w:val="num" w:pos="1440"/>
+        </w:tabs>
+        <w:ind w:left="1440" w:hanging="360"/>
+      </w:pPr>
+      <w:rPr>
+        <w:rFonts w:ascii="Courier New" w:hAnsi="Courier New" w:hint="default"/>
+        <w:sz w:val="20"/>
+      </w:rPr>
+    </w:lvl>
+    <w:lvl w:ilvl="2" w:tentative="1">
+      <w:start w:val="1"/>
+      <w:numFmt w:val="bullet"/>
+      <w:lvlText w:val=""/>
+      <w:lvlJc w:val="left"/>
+      <w:pPr>
+        <w:tabs>
+          <w:tab w:val="num" w:pos="2160"/>
+        </w:tabs>
+        <w:ind w:left="2160" w:hanging="360"/>
+      </w:pPr>
+      <w:rPr>
+        <w:rFonts w:ascii="Wingdings" w:hAnsi="Wingdings" w:hint="default"/>
+        <w:sz w:val="20"/>
+      </w:rPr>
+    </w:lvl>
+    <w:lvl w:ilvl="3" w:tentative="1">
+      <w:start w:val="1"/>
+      <w:numFmt w:val="bullet"/>
+      <w:lvlText w:val=""/>
+      <w:lvlJc w:val="left"/>
+      <w:pPr>
+        <w:tabs>
+          <w:tab w:val="num" w:pos="2880"/>
+        </w:tabs>
+        <w:ind w:left="2880" w:hanging="360"/>
+      </w:pPr>
+      <w:rPr>
+        <w:rFonts w:ascii="Wingdings" w:hAnsi="Wingdings" w:hint="default"/>
+        <w:sz w:val="20"/>
+      </w:rPr>
+    </w:lvl>
+    <w:lvl w:ilvl="4" w:tentative="1">
+      <w:start w:val="1"/>
+      <w:numFmt w:val="bullet"/>
+      <w:lvlText w:val=""/>
+      <w:lvlJc w:val="left"/>
+      <w:pPr>
+        <w:tabs>
+          <w:tab w:val="num" w:pos="3600"/>
+        </w:tabs>
+        <w:ind w:left="3600" w:hanging="360"/>
+      </w:pPr>
+      <w:rPr>
+        <w:rFonts w:ascii="Wingdings" w:hAnsi="Wingdings" w:hint="default"/>
+        <w:sz w:val="20"/>
+      </w:rPr>
+    </w:lvl>
+    <w:lvl w:ilvl="5" w:tentative="1">
+      <w:start w:val="1"/>
+      <w:numFmt w:val="bullet"/>
+      <w:lvlText w:val=""/>
+      <w:lvlJc w:val="left"/>
+      <w:pPr>
+        <w:tabs>
+          <w:tab w:val="num" w:pos="4320"/>
+        </w:tabs>
+        <w:ind w:left="4320" w:hanging="360"/>
+      </w:pPr>
+      <w:rPr>
+        <w:rFonts w:ascii="Wingdings" w:hAnsi="Wingdings" w:hint="default"/>
+        <w:sz w:val="20"/>
+      </w:rPr>
+    </w:lvl>
+    <w:lvl w:ilvl="6" w:tentative="1">
+      <w:start w:val="1"/>
+      <w:numFmt w:val="bullet"/>
+      <w:lvlText w:val=""/>
+      <w:lvlJc w:val="left"/>
+      <w:pPr>
+        <w:tabs>
+          <w:tab w:val="num" w:pos="5040"/>
+        </w:tabs>
+        <w:ind w:left="5040" w:hanging="360"/>
+      </w:pPr>
+      <w:rPr>
+        <w:rFonts w:ascii="Wingdings" w:hAnsi="Wingdings" w:hint="default"/>
+        <w:sz w:val="20"/>
+      </w:rPr>
+    </w:lvl>
+    <w:lvl w:ilvl="7" w:tentative="1">
+      <w:start w:val="1"/>
+      <w:numFmt w:val="bullet"/>
+      <w:lvlText w:val=""/>
+      <w:lvlJc w:val="left"/>
+      <w:pPr>
+        <w:tabs>
+          <w:tab w:val="num" w:pos="5760"/>
+        </w:tabs>
+        <w:ind w:left="5760" w:hanging="360"/>
+      </w:pPr>
+      <w:rPr>
+        <w:rFonts w:ascii="Wingdings" w:hAnsi="Wingdings" w:hint="default"/>
+        <w:sz w:val="20"/>
+      </w:rPr>
+    </w:lvl>
+    <w:lvl w:ilvl="8" w:tentative="1">
+      <w:start w:val="1"/>
+      <w:numFmt w:val="bullet"/>
+      <w:lvlText w:val=""/>
+      <w:lvlJc w:val="left"/>
+      <w:pPr>
+        <w:tabs>
+          <w:tab w:val="num" w:pos="6480"/>
+        </w:tabs>
+        <w:ind w:left="6480" w:hanging="360"/>
+      </w:pPr>
+      <w:rPr>
+        <w:rFonts w:ascii="Wingdings" w:hAnsi="Wingdings" w:hint="default"/>
+        <w:sz w:val="20"/>
+      </w:rPr>
+    </w:lvl>
+  </w:abstractNum>
+  <w:abstractNum w:abstractNumId="12" w15:restartNumberingAfterBreak="0">
     <w:nsid w:val="3F544915"/>
     <w:multiLevelType w:val="multilevel"/>
     <w:tmpl w:val="E250D376"/>
@@ -12563,7 +16095,7 @@
       </w:rPr>
     </w:lvl>
   </w:abstractNum>
-  <w:abstractNum w:abstractNumId="9" w15:restartNumberingAfterBreak="0">
+  <w:abstractNum w:abstractNumId="13" w15:restartNumberingAfterBreak="0">
     <w:nsid w:val="450E6D7F"/>
     <w:multiLevelType w:val="multilevel"/>
     <w:tmpl w:val="C6880B74"/>
@@ -12712,7 +16244,7 @@
       </w:rPr>
     </w:lvl>
   </w:abstractNum>
-  <w:abstractNum w:abstractNumId="10" w15:restartNumberingAfterBreak="0">
+  <w:abstractNum w:abstractNumId="14" w15:restartNumberingAfterBreak="0">
     <w:nsid w:val="45E52ABA"/>
     <w:multiLevelType w:val="multilevel"/>
     <w:tmpl w:val="D4B4A206"/>
@@ -12861,7 +16393,7 @@
       </w:rPr>
     </w:lvl>
   </w:abstractNum>
-  <w:abstractNum w:abstractNumId="11" w15:restartNumberingAfterBreak="0">
+  <w:abstractNum w:abstractNumId="15" w15:restartNumberingAfterBreak="0">
     <w:nsid w:val="47334480"/>
     <w:multiLevelType w:val="multilevel"/>
     <w:tmpl w:val="41945E5E"/>
@@ -13010,7 +16542,120 @@
       </w:rPr>
     </w:lvl>
   </w:abstractNum>
-  <w:abstractNum w:abstractNumId="12" w15:restartNumberingAfterBreak="0">
+  <w:abstractNum w:abstractNumId="16" w15:restartNumberingAfterBreak="0">
+    <w:nsid w:val="5034204A"/>
+    <w:multiLevelType w:val="multilevel"/>
+    <w:tmpl w:val="FAEE138A"/>
+    <w:lvl w:ilvl="0">
+      <w:start w:val="1"/>
+      <w:numFmt w:val="decimal"/>
+      <w:lvlText w:val="%1."/>
+      <w:lvlJc w:val="left"/>
+      <w:pPr>
+        <w:tabs>
+          <w:tab w:val="num" w:pos="720"/>
+        </w:tabs>
+        <w:ind w:left="720" w:hanging="360"/>
+      </w:pPr>
+    </w:lvl>
+    <w:lvl w:ilvl="1" w:tentative="1">
+      <w:start w:val="1"/>
+      <w:numFmt w:val="decimal"/>
+      <w:lvlText w:val="%2."/>
+      <w:lvlJc w:val="left"/>
+      <w:pPr>
+        <w:tabs>
+          <w:tab w:val="num" w:pos="1440"/>
+        </w:tabs>
+        <w:ind w:left="1440" w:hanging="360"/>
+      </w:pPr>
+    </w:lvl>
+    <w:lvl w:ilvl="2" w:tentative="1">
+      <w:start w:val="1"/>
+      <w:numFmt w:val="decimal"/>
+      <w:lvlText w:val="%3."/>
+      <w:lvlJc w:val="left"/>
+      <w:pPr>
+        <w:tabs>
+          <w:tab w:val="num" w:pos="2160"/>
+        </w:tabs>
+        <w:ind w:left="2160" w:hanging="360"/>
+      </w:pPr>
+    </w:lvl>
+    <w:lvl w:ilvl="3" w:tentative="1">
+      <w:start w:val="1"/>
+      <w:numFmt w:val="decimal"/>
+      <w:lvlText w:val="%4."/>
+      <w:lvlJc w:val="left"/>
+      <w:pPr>
+        <w:tabs>
+          <w:tab w:val="num" w:pos="2880"/>
+        </w:tabs>
+        <w:ind w:left="2880" w:hanging="360"/>
+      </w:pPr>
+    </w:lvl>
+    <w:lvl w:ilvl="4" w:tentative="1">
+      <w:start w:val="1"/>
+      <w:numFmt w:val="decimal"/>
+      <w:lvlText w:val="%5."/>
+      <w:lvlJc w:val="left"/>
+      <w:pPr>
+        <w:tabs>
+          <w:tab w:val="num" w:pos="3600"/>
+        </w:tabs>
+        <w:ind w:left="3600" w:hanging="360"/>
+      </w:pPr>
+    </w:lvl>
+    <w:lvl w:ilvl="5" w:tentative="1">
+      <w:start w:val="1"/>
+      <w:numFmt w:val="decimal"/>
+      <w:lvlText w:val="%6."/>
+      <w:lvlJc w:val="left"/>
+      <w:pPr>
+        <w:tabs>
+          <w:tab w:val="num" w:pos="4320"/>
+        </w:tabs>
+        <w:ind w:left="4320" w:hanging="360"/>
+      </w:pPr>
+    </w:lvl>
+    <w:lvl w:ilvl="6" w:tentative="1">
+      <w:start w:val="1"/>
+      <w:numFmt w:val="decimal"/>
+      <w:lvlText w:val="%7."/>
+      <w:lvlJc w:val="left"/>
+      <w:pPr>
+        <w:tabs>
+          <w:tab w:val="num" w:pos="5040"/>
+        </w:tabs>
+        <w:ind w:left="5040" w:hanging="360"/>
+      </w:pPr>
+    </w:lvl>
+    <w:lvl w:ilvl="7" w:tentative="1">
+      <w:start w:val="1"/>
+      <w:numFmt w:val="decimal"/>
+      <w:lvlText w:val="%8."/>
+      <w:lvlJc w:val="left"/>
+      <w:pPr>
+        <w:tabs>
+          <w:tab w:val="num" w:pos="5760"/>
+        </w:tabs>
+        <w:ind w:left="5760" w:hanging="360"/>
+      </w:pPr>
+    </w:lvl>
+    <w:lvl w:ilvl="8" w:tentative="1">
+      <w:start w:val="1"/>
+      <w:numFmt w:val="decimal"/>
+      <w:lvlText w:val="%9."/>
+      <w:lvlJc w:val="left"/>
+      <w:pPr>
+        <w:tabs>
+          <w:tab w:val="num" w:pos="6480"/>
+        </w:tabs>
+        <w:ind w:left="6480" w:hanging="360"/>
+      </w:pPr>
+    </w:lvl>
+  </w:abstractNum>
+  <w:abstractNum w:abstractNumId="17" w15:restartNumberingAfterBreak="0">
     <w:nsid w:val="524D15EB"/>
     <w:multiLevelType w:val="multilevel"/>
     <w:tmpl w:val="0152DF54"/>
@@ -13159,7 +16804,7 @@
       </w:rPr>
     </w:lvl>
   </w:abstractNum>
-  <w:abstractNum w:abstractNumId="13" w15:restartNumberingAfterBreak="0">
+  <w:abstractNum w:abstractNumId="18" w15:restartNumberingAfterBreak="0">
     <w:nsid w:val="5365106A"/>
     <w:multiLevelType w:val="multilevel"/>
     <w:tmpl w:val="DABE61EC"/>
@@ -13308,7 +16953,7 @@
       </w:rPr>
     </w:lvl>
   </w:abstractNum>
-  <w:abstractNum w:abstractNumId="14" w15:restartNumberingAfterBreak="0">
+  <w:abstractNum w:abstractNumId="19" w15:restartNumberingAfterBreak="0">
     <w:nsid w:val="56C32F6C"/>
     <w:multiLevelType w:val="multilevel"/>
     <w:tmpl w:val="0BAE82E4"/>
@@ -13457,7 +17102,7 @@
       </w:rPr>
     </w:lvl>
   </w:abstractNum>
-  <w:abstractNum w:abstractNumId="15" w15:restartNumberingAfterBreak="0">
+  <w:abstractNum w:abstractNumId="20" w15:restartNumberingAfterBreak="0">
     <w:nsid w:val="5E942208"/>
     <w:multiLevelType w:val="multilevel"/>
     <w:tmpl w:val="745EAB2E"/>
@@ -13606,7 +17251,7 @@
       </w:rPr>
     </w:lvl>
   </w:abstractNum>
-  <w:abstractNum w:abstractNumId="16" w15:restartNumberingAfterBreak="0">
+  <w:abstractNum w:abstractNumId="21" w15:restartNumberingAfterBreak="0">
     <w:nsid w:val="5F516525"/>
     <w:multiLevelType w:val="multilevel"/>
     <w:tmpl w:val="0690081A"/>
@@ -13755,7 +17400,7 @@
       </w:rPr>
     </w:lvl>
   </w:abstractNum>
-  <w:abstractNum w:abstractNumId="17" w15:restartNumberingAfterBreak="0">
+  <w:abstractNum w:abstractNumId="22" w15:restartNumberingAfterBreak="0">
     <w:nsid w:val="603C23F8"/>
     <w:multiLevelType w:val="multilevel"/>
     <w:tmpl w:val="2E0E3FF4"/>
@@ -13904,7 +17549,156 @@
       </w:rPr>
     </w:lvl>
   </w:abstractNum>
-  <w:abstractNum w:abstractNumId="18" w15:restartNumberingAfterBreak="0">
+  <w:abstractNum w:abstractNumId="23" w15:restartNumberingAfterBreak="0">
+    <w:nsid w:val="60D47571"/>
+    <w:multiLevelType w:val="multilevel"/>
+    <w:tmpl w:val="71E60B36"/>
+    <w:lvl w:ilvl="0">
+      <w:start w:val="1"/>
+      <w:numFmt w:val="bullet"/>
+      <w:lvlText w:val=""/>
+      <w:lvlJc w:val="left"/>
+      <w:pPr>
+        <w:tabs>
+          <w:tab w:val="num" w:pos="720"/>
+        </w:tabs>
+        <w:ind w:left="720" w:hanging="360"/>
+      </w:pPr>
+      <w:rPr>
+        <w:rFonts w:ascii="Symbol" w:hAnsi="Symbol" w:hint="default"/>
+        <w:sz w:val="20"/>
+      </w:rPr>
+    </w:lvl>
+    <w:lvl w:ilvl="1" w:tentative="1">
+      <w:start w:val="1"/>
+      <w:numFmt w:val="bullet"/>
+      <w:lvlText w:val="o"/>
+      <w:lvlJc w:val="left"/>
+      <w:pPr>
+        <w:tabs>
+          <w:tab w:val="num" w:pos="1440"/>
+        </w:tabs>
+        <w:ind w:left="1440" w:hanging="360"/>
+      </w:pPr>
+      <w:rPr>
+        <w:rFonts w:ascii="Courier New" w:hAnsi="Courier New" w:hint="default"/>
+        <w:sz w:val="20"/>
+      </w:rPr>
+    </w:lvl>
+    <w:lvl w:ilvl="2" w:tentative="1">
+      <w:start w:val="1"/>
+      <w:numFmt w:val="bullet"/>
+      <w:lvlText w:val=""/>
+      <w:lvlJc w:val="left"/>
+      <w:pPr>
+        <w:tabs>
+          <w:tab w:val="num" w:pos="2160"/>
+        </w:tabs>
+        <w:ind w:left="2160" w:hanging="360"/>
+      </w:pPr>
+      <w:rPr>
+        <w:rFonts w:ascii="Wingdings" w:hAnsi="Wingdings" w:hint="default"/>
+        <w:sz w:val="20"/>
+      </w:rPr>
+    </w:lvl>
+    <w:lvl w:ilvl="3" w:tentative="1">
+      <w:start w:val="1"/>
+      <w:numFmt w:val="bullet"/>
+      <w:lvlText w:val=""/>
+      <w:lvlJc w:val="left"/>
+      <w:pPr>
+        <w:tabs>
+          <w:tab w:val="num" w:pos="2880"/>
+        </w:tabs>
+        <w:ind w:left="2880" w:hanging="360"/>
+      </w:pPr>
+      <w:rPr>
+        <w:rFonts w:ascii="Wingdings" w:hAnsi="Wingdings" w:hint="default"/>
+        <w:sz w:val="20"/>
+      </w:rPr>
+    </w:lvl>
+    <w:lvl w:ilvl="4" w:tentative="1">
+      <w:start w:val="1"/>
+      <w:numFmt w:val="bullet"/>
+      <w:lvlText w:val=""/>
+      <w:lvlJc w:val="left"/>
+      <w:pPr>
+        <w:tabs>
+          <w:tab w:val="num" w:pos="3600"/>
+        </w:tabs>
+        <w:ind w:left="3600" w:hanging="360"/>
+      </w:pPr>
+      <w:rPr>
+        <w:rFonts w:ascii="Wingdings" w:hAnsi="Wingdings" w:hint="default"/>
+        <w:sz w:val="20"/>
+      </w:rPr>
+    </w:lvl>
+    <w:lvl w:ilvl="5" w:tentative="1">
+      <w:start w:val="1"/>
+      <w:numFmt w:val="bullet"/>
+      <w:lvlText w:val=""/>
+      <w:lvlJc w:val="left"/>
+      <w:pPr>
+        <w:tabs>
+          <w:tab w:val="num" w:pos="4320"/>
+        </w:tabs>
+        <w:ind w:left="4320" w:hanging="360"/>
+      </w:pPr>
+      <w:rPr>
+        <w:rFonts w:ascii="Wingdings" w:hAnsi="Wingdings" w:hint="default"/>
+        <w:sz w:val="20"/>
+      </w:rPr>
+    </w:lvl>
+    <w:lvl w:ilvl="6" w:tentative="1">
+      <w:start w:val="1"/>
+      <w:numFmt w:val="bullet"/>
+      <w:lvlText w:val=""/>
+      <w:lvlJc w:val="left"/>
+      <w:pPr>
+        <w:tabs>
+          <w:tab w:val="num" w:pos="5040"/>
+        </w:tabs>
+        <w:ind w:left="5040" w:hanging="360"/>
+      </w:pPr>
+      <w:rPr>
+        <w:rFonts w:ascii="Wingdings" w:hAnsi="Wingdings" w:hint="default"/>
+        <w:sz w:val="20"/>
+      </w:rPr>
+    </w:lvl>
+    <w:lvl w:ilvl="7" w:tentative="1">
+      <w:start w:val="1"/>
+      <w:numFmt w:val="bullet"/>
+      <w:lvlText w:val=""/>
+      <w:lvlJc w:val="left"/>
+      <w:pPr>
+        <w:tabs>
+          <w:tab w:val="num" w:pos="5760"/>
+        </w:tabs>
+        <w:ind w:left="5760" w:hanging="360"/>
+      </w:pPr>
+      <w:rPr>
+        <w:rFonts w:ascii="Wingdings" w:hAnsi="Wingdings" w:hint="default"/>
+        <w:sz w:val="20"/>
+      </w:rPr>
+    </w:lvl>
+    <w:lvl w:ilvl="8" w:tentative="1">
+      <w:start w:val="1"/>
+      <w:numFmt w:val="bullet"/>
+      <w:lvlText w:val=""/>
+      <w:lvlJc w:val="left"/>
+      <w:pPr>
+        <w:tabs>
+          <w:tab w:val="num" w:pos="6480"/>
+        </w:tabs>
+        <w:ind w:left="6480" w:hanging="360"/>
+      </w:pPr>
+      <w:rPr>
+        <w:rFonts w:ascii="Wingdings" w:hAnsi="Wingdings" w:hint="default"/>
+        <w:sz w:val="20"/>
+      </w:rPr>
+    </w:lvl>
+  </w:abstractNum>
+  <w:abstractNum w:abstractNumId="24" w15:restartNumberingAfterBreak="0">
     <w:nsid w:val="6261683D"/>
     <w:multiLevelType w:val="multilevel"/>
     <w:tmpl w:val="54444716"/>
@@ -14053,7 +17847,7 @@
       </w:rPr>
     </w:lvl>
   </w:abstractNum>
-  <w:abstractNum w:abstractNumId="19" w15:restartNumberingAfterBreak="0">
+  <w:abstractNum w:abstractNumId="25" w15:restartNumberingAfterBreak="0">
     <w:nsid w:val="63782CE2"/>
     <w:multiLevelType w:val="multilevel"/>
     <w:tmpl w:val="4E7EC04C"/>
@@ -14202,7 +17996,7 @@
       </w:rPr>
     </w:lvl>
   </w:abstractNum>
-  <w:abstractNum w:abstractNumId="20" w15:restartNumberingAfterBreak="0">
+  <w:abstractNum w:abstractNumId="26" w15:restartNumberingAfterBreak="0">
     <w:nsid w:val="6435180B"/>
     <w:multiLevelType w:val="multilevel"/>
     <w:tmpl w:val="35F0A6A2"/>
@@ -14351,7 +18145,7 @@
       </w:rPr>
     </w:lvl>
   </w:abstractNum>
-  <w:abstractNum w:abstractNumId="21" w15:restartNumberingAfterBreak="0">
+  <w:abstractNum w:abstractNumId="27" w15:restartNumberingAfterBreak="0">
     <w:nsid w:val="69A34DC6"/>
     <w:multiLevelType w:val="multilevel"/>
     <w:tmpl w:val="F364EF0A"/>
@@ -14500,7 +18294,7 @@
       </w:rPr>
     </w:lvl>
   </w:abstractNum>
-  <w:abstractNum w:abstractNumId="22" w15:restartNumberingAfterBreak="0">
+  <w:abstractNum w:abstractNumId="28" w15:restartNumberingAfterBreak="0">
     <w:nsid w:val="6BC11D4E"/>
     <w:multiLevelType w:val="multilevel"/>
     <w:tmpl w:val="CFFA460E"/>
@@ -14649,7 +18443,7 @@
       </w:rPr>
     </w:lvl>
   </w:abstractNum>
-  <w:abstractNum w:abstractNumId="23" w15:restartNumberingAfterBreak="0">
+  <w:abstractNum w:abstractNumId="29" w15:restartNumberingAfterBreak="0">
     <w:nsid w:val="6BC77865"/>
     <w:multiLevelType w:val="multilevel"/>
     <w:tmpl w:val="F66290C0"/>
@@ -14798,7 +18592,7 @@
       </w:rPr>
     </w:lvl>
   </w:abstractNum>
-  <w:abstractNum w:abstractNumId="24" w15:restartNumberingAfterBreak="0">
+  <w:abstractNum w:abstractNumId="30" w15:restartNumberingAfterBreak="0">
     <w:nsid w:val="6BFB44FD"/>
     <w:multiLevelType w:val="multilevel"/>
     <w:tmpl w:val="C1347D9E"/>
@@ -14947,7 +18741,156 @@
       </w:rPr>
     </w:lvl>
   </w:abstractNum>
-  <w:abstractNum w:abstractNumId="25" w15:restartNumberingAfterBreak="0">
+  <w:abstractNum w:abstractNumId="31" w15:restartNumberingAfterBreak="0">
+    <w:nsid w:val="6C6A5A61"/>
+    <w:multiLevelType w:val="multilevel"/>
+    <w:tmpl w:val="183E7C04"/>
+    <w:lvl w:ilvl="0">
+      <w:start w:val="1"/>
+      <w:numFmt w:val="bullet"/>
+      <w:lvlText w:val=""/>
+      <w:lvlJc w:val="left"/>
+      <w:pPr>
+        <w:tabs>
+          <w:tab w:val="num" w:pos="720"/>
+        </w:tabs>
+        <w:ind w:left="720" w:hanging="360"/>
+      </w:pPr>
+      <w:rPr>
+        <w:rFonts w:ascii="Symbol" w:hAnsi="Symbol" w:hint="default"/>
+        <w:sz w:val="20"/>
+      </w:rPr>
+    </w:lvl>
+    <w:lvl w:ilvl="1" w:tentative="1">
+      <w:start w:val="1"/>
+      <w:numFmt w:val="bullet"/>
+      <w:lvlText w:val="o"/>
+      <w:lvlJc w:val="left"/>
+      <w:pPr>
+        <w:tabs>
+          <w:tab w:val="num" w:pos="1440"/>
+        </w:tabs>
+        <w:ind w:left="1440" w:hanging="360"/>
+      </w:pPr>
+      <w:rPr>
+        <w:rFonts w:ascii="Courier New" w:hAnsi="Courier New" w:hint="default"/>
+        <w:sz w:val="20"/>
+      </w:rPr>
+    </w:lvl>
+    <w:lvl w:ilvl="2" w:tentative="1">
+      <w:start w:val="1"/>
+      <w:numFmt w:val="bullet"/>
+      <w:lvlText w:val=""/>
+      <w:lvlJc w:val="left"/>
+      <w:pPr>
+        <w:tabs>
+          <w:tab w:val="num" w:pos="2160"/>
+        </w:tabs>
+        <w:ind w:left="2160" w:hanging="360"/>
+      </w:pPr>
+      <w:rPr>
+        <w:rFonts w:ascii="Wingdings" w:hAnsi="Wingdings" w:hint="default"/>
+        <w:sz w:val="20"/>
+      </w:rPr>
+    </w:lvl>
+    <w:lvl w:ilvl="3" w:tentative="1">
+      <w:start w:val="1"/>
+      <w:numFmt w:val="bullet"/>
+      <w:lvlText w:val=""/>
+      <w:lvlJc w:val="left"/>
+      <w:pPr>
+        <w:tabs>
+          <w:tab w:val="num" w:pos="2880"/>
+        </w:tabs>
+        <w:ind w:left="2880" w:hanging="360"/>
+      </w:pPr>
+      <w:rPr>
+        <w:rFonts w:ascii="Wingdings" w:hAnsi="Wingdings" w:hint="default"/>
+        <w:sz w:val="20"/>
+      </w:rPr>
+    </w:lvl>
+    <w:lvl w:ilvl="4" w:tentative="1">
+      <w:start w:val="1"/>
+      <w:numFmt w:val="bullet"/>
+      <w:lvlText w:val=""/>
+      <w:lvlJc w:val="left"/>
+      <w:pPr>
+        <w:tabs>
+          <w:tab w:val="num" w:pos="3600"/>
+        </w:tabs>
+        <w:ind w:left="3600" w:hanging="360"/>
+      </w:pPr>
+      <w:rPr>
+        <w:rFonts w:ascii="Wingdings" w:hAnsi="Wingdings" w:hint="default"/>
+        <w:sz w:val="20"/>
+      </w:rPr>
+    </w:lvl>
+    <w:lvl w:ilvl="5" w:tentative="1">
+      <w:start w:val="1"/>
+      <w:numFmt w:val="bullet"/>
+      <w:lvlText w:val=""/>
+      <w:lvlJc w:val="left"/>
+      <w:pPr>
+        <w:tabs>
+          <w:tab w:val="num" w:pos="4320"/>
+        </w:tabs>
+        <w:ind w:left="4320" w:hanging="360"/>
+      </w:pPr>
+      <w:rPr>
+        <w:rFonts w:ascii="Wingdings" w:hAnsi="Wingdings" w:hint="default"/>
+        <w:sz w:val="20"/>
+      </w:rPr>
+    </w:lvl>
+    <w:lvl w:ilvl="6" w:tentative="1">
+      <w:start w:val="1"/>
+      <w:numFmt w:val="bullet"/>
+      <w:lvlText w:val=""/>
+      <w:lvlJc w:val="left"/>
+      <w:pPr>
+        <w:tabs>
+          <w:tab w:val="num" w:pos="5040"/>
+        </w:tabs>
+        <w:ind w:left="5040" w:hanging="360"/>
+      </w:pPr>
+      <w:rPr>
+        <w:rFonts w:ascii="Wingdings" w:hAnsi="Wingdings" w:hint="default"/>
+        <w:sz w:val="20"/>
+      </w:rPr>
+    </w:lvl>
+    <w:lvl w:ilvl="7" w:tentative="1">
+      <w:start w:val="1"/>
+      <w:numFmt w:val="bullet"/>
+      <w:lvlText w:val=""/>
+      <w:lvlJc w:val="left"/>
+      <w:pPr>
+        <w:tabs>
+          <w:tab w:val="num" w:pos="5760"/>
+        </w:tabs>
+        <w:ind w:left="5760" w:hanging="360"/>
+      </w:pPr>
+      <w:rPr>
+        <w:rFonts w:ascii="Wingdings" w:hAnsi="Wingdings" w:hint="default"/>
+        <w:sz w:val="20"/>
+      </w:rPr>
+    </w:lvl>
+    <w:lvl w:ilvl="8" w:tentative="1">
+      <w:start w:val="1"/>
+      <w:numFmt w:val="bullet"/>
+      <w:lvlText w:val=""/>
+      <w:lvlJc w:val="left"/>
+      <w:pPr>
+        <w:tabs>
+          <w:tab w:val="num" w:pos="6480"/>
+        </w:tabs>
+        <w:ind w:left="6480" w:hanging="360"/>
+      </w:pPr>
+      <w:rPr>
+        <w:rFonts w:ascii="Wingdings" w:hAnsi="Wingdings" w:hint="default"/>
+        <w:sz w:val="20"/>
+      </w:rPr>
+    </w:lvl>
+  </w:abstractNum>
+  <w:abstractNum w:abstractNumId="32" w15:restartNumberingAfterBreak="0">
     <w:nsid w:val="6FF12DB1"/>
     <w:multiLevelType w:val="multilevel"/>
     <w:tmpl w:val="15B2C5B8"/>
@@ -15096,7 +19039,7 @@
       </w:rPr>
     </w:lvl>
   </w:abstractNum>
-  <w:abstractNum w:abstractNumId="26" w15:restartNumberingAfterBreak="0">
+  <w:abstractNum w:abstractNumId="33" w15:restartNumberingAfterBreak="0">
     <w:nsid w:val="70D03A25"/>
     <w:multiLevelType w:val="multilevel"/>
     <w:tmpl w:val="C200EC36"/>
@@ -15245,7 +19188,7 @@
       </w:rPr>
     </w:lvl>
   </w:abstractNum>
-  <w:abstractNum w:abstractNumId="27" w15:restartNumberingAfterBreak="0">
+  <w:abstractNum w:abstractNumId="34" w15:restartNumberingAfterBreak="0">
     <w:nsid w:val="75185EB9"/>
     <w:multiLevelType w:val="multilevel"/>
     <w:tmpl w:val="3186553A"/>
@@ -15394,7 +19337,7 @@
       </w:rPr>
     </w:lvl>
   </w:abstractNum>
-  <w:abstractNum w:abstractNumId="28" w15:restartNumberingAfterBreak="0">
+  <w:abstractNum w:abstractNumId="35" w15:restartNumberingAfterBreak="0">
     <w:nsid w:val="7A781082"/>
     <w:multiLevelType w:val="multilevel"/>
     <w:tmpl w:val="FD703CA2"/>
@@ -15543,7 +19486,454 @@
       </w:rPr>
     </w:lvl>
   </w:abstractNum>
-  <w:abstractNum w:abstractNumId="29" w15:restartNumberingAfterBreak="0">
+  <w:abstractNum w:abstractNumId="36" w15:restartNumberingAfterBreak="0">
+    <w:nsid w:val="7CB50877"/>
+    <w:multiLevelType w:val="multilevel"/>
+    <w:tmpl w:val="BD40DBCC"/>
+    <w:lvl w:ilvl="0">
+      <w:start w:val="1"/>
+      <w:numFmt w:val="bullet"/>
+      <w:lvlText w:val=""/>
+      <w:lvlJc w:val="left"/>
+      <w:pPr>
+        <w:tabs>
+          <w:tab w:val="num" w:pos="720"/>
+        </w:tabs>
+        <w:ind w:left="720" w:hanging="360"/>
+      </w:pPr>
+      <w:rPr>
+        <w:rFonts w:ascii="Symbol" w:hAnsi="Symbol" w:hint="default"/>
+        <w:sz w:val="20"/>
+      </w:rPr>
+    </w:lvl>
+    <w:lvl w:ilvl="1" w:tentative="1">
+      <w:start w:val="1"/>
+      <w:numFmt w:val="bullet"/>
+      <w:lvlText w:val="o"/>
+      <w:lvlJc w:val="left"/>
+      <w:pPr>
+        <w:tabs>
+          <w:tab w:val="num" w:pos="1440"/>
+        </w:tabs>
+        <w:ind w:left="1440" w:hanging="360"/>
+      </w:pPr>
+      <w:rPr>
+        <w:rFonts w:ascii="Courier New" w:hAnsi="Courier New" w:hint="default"/>
+        <w:sz w:val="20"/>
+      </w:rPr>
+    </w:lvl>
+    <w:lvl w:ilvl="2" w:tentative="1">
+      <w:start w:val="1"/>
+      <w:numFmt w:val="bullet"/>
+      <w:lvlText w:val=""/>
+      <w:lvlJc w:val="left"/>
+      <w:pPr>
+        <w:tabs>
+          <w:tab w:val="num" w:pos="2160"/>
+        </w:tabs>
+        <w:ind w:left="2160" w:hanging="360"/>
+      </w:pPr>
+      <w:rPr>
+        <w:rFonts w:ascii="Wingdings" w:hAnsi="Wingdings" w:hint="default"/>
+        <w:sz w:val="20"/>
+      </w:rPr>
+    </w:lvl>
+    <w:lvl w:ilvl="3" w:tentative="1">
+      <w:start w:val="1"/>
+      <w:numFmt w:val="bullet"/>
+      <w:lvlText w:val=""/>
+      <w:lvlJc w:val="left"/>
+      <w:pPr>
+        <w:tabs>
+          <w:tab w:val="num" w:pos="2880"/>
+        </w:tabs>
+        <w:ind w:left="2880" w:hanging="360"/>
+      </w:pPr>
+      <w:rPr>
+        <w:rFonts w:ascii="Wingdings" w:hAnsi="Wingdings" w:hint="default"/>
+        <w:sz w:val="20"/>
+      </w:rPr>
+    </w:lvl>
+    <w:lvl w:ilvl="4" w:tentative="1">
+      <w:start w:val="1"/>
+      <w:numFmt w:val="bullet"/>
+      <w:lvlText w:val=""/>
+      <w:lvlJc w:val="left"/>
+      <w:pPr>
+        <w:tabs>
+          <w:tab w:val="num" w:pos="3600"/>
+        </w:tabs>
+        <w:ind w:left="3600" w:hanging="360"/>
+      </w:pPr>
+      <w:rPr>
+        <w:rFonts w:ascii="Wingdings" w:hAnsi="Wingdings" w:hint="default"/>
+        <w:sz w:val="20"/>
+      </w:rPr>
+    </w:lvl>
+    <w:lvl w:ilvl="5" w:tentative="1">
+      <w:start w:val="1"/>
+      <w:numFmt w:val="bullet"/>
+      <w:lvlText w:val=""/>
+      <w:lvlJc w:val="left"/>
+      <w:pPr>
+        <w:tabs>
+          <w:tab w:val="num" w:pos="4320"/>
+        </w:tabs>
+        <w:ind w:left="4320" w:hanging="360"/>
+      </w:pPr>
+      <w:rPr>
+        <w:rFonts w:ascii="Wingdings" w:hAnsi="Wingdings" w:hint="default"/>
+        <w:sz w:val="20"/>
+      </w:rPr>
+    </w:lvl>
+    <w:lvl w:ilvl="6" w:tentative="1">
+      <w:start w:val="1"/>
+      <w:numFmt w:val="bullet"/>
+      <w:lvlText w:val=""/>
+      <w:lvlJc w:val="left"/>
+      <w:pPr>
+        <w:tabs>
+          <w:tab w:val="num" w:pos="5040"/>
+        </w:tabs>
+        <w:ind w:left="5040" w:hanging="360"/>
+      </w:pPr>
+      <w:rPr>
+        <w:rFonts w:ascii="Wingdings" w:hAnsi="Wingdings" w:hint="default"/>
+        <w:sz w:val="20"/>
+      </w:rPr>
+    </w:lvl>
+    <w:lvl w:ilvl="7" w:tentative="1">
+      <w:start w:val="1"/>
+      <w:numFmt w:val="bullet"/>
+      <w:lvlText w:val=""/>
+      <w:lvlJc w:val="left"/>
+      <w:pPr>
+        <w:tabs>
+          <w:tab w:val="num" w:pos="5760"/>
+        </w:tabs>
+        <w:ind w:left="5760" w:hanging="360"/>
+      </w:pPr>
+      <w:rPr>
+        <w:rFonts w:ascii="Wingdings" w:hAnsi="Wingdings" w:hint="default"/>
+        <w:sz w:val="20"/>
+      </w:rPr>
+    </w:lvl>
+    <w:lvl w:ilvl="8" w:tentative="1">
+      <w:start w:val="1"/>
+      <w:numFmt w:val="bullet"/>
+      <w:lvlText w:val=""/>
+      <w:lvlJc w:val="left"/>
+      <w:pPr>
+        <w:tabs>
+          <w:tab w:val="num" w:pos="6480"/>
+        </w:tabs>
+        <w:ind w:left="6480" w:hanging="360"/>
+      </w:pPr>
+      <w:rPr>
+        <w:rFonts w:ascii="Wingdings" w:hAnsi="Wingdings" w:hint="default"/>
+        <w:sz w:val="20"/>
+      </w:rPr>
+    </w:lvl>
+  </w:abstractNum>
+  <w:abstractNum w:abstractNumId="37" w15:restartNumberingAfterBreak="0">
+    <w:nsid w:val="7F1B090C"/>
+    <w:multiLevelType w:val="multilevel"/>
+    <w:tmpl w:val="6ACA4140"/>
+    <w:lvl w:ilvl="0">
+      <w:start w:val="1"/>
+      <w:numFmt w:val="bullet"/>
+      <w:lvlText w:val=""/>
+      <w:lvlJc w:val="left"/>
+      <w:pPr>
+        <w:tabs>
+          <w:tab w:val="num" w:pos="720"/>
+        </w:tabs>
+        <w:ind w:left="720" w:hanging="360"/>
+      </w:pPr>
+      <w:rPr>
+        <w:rFonts w:ascii="Symbol" w:hAnsi="Symbol" w:hint="default"/>
+        <w:sz w:val="20"/>
+      </w:rPr>
+    </w:lvl>
+    <w:lvl w:ilvl="1" w:tentative="1">
+      <w:start w:val="1"/>
+      <w:numFmt w:val="bullet"/>
+      <w:lvlText w:val="o"/>
+      <w:lvlJc w:val="left"/>
+      <w:pPr>
+        <w:tabs>
+          <w:tab w:val="num" w:pos="1440"/>
+        </w:tabs>
+        <w:ind w:left="1440" w:hanging="360"/>
+      </w:pPr>
+      <w:rPr>
+        <w:rFonts w:ascii="Courier New" w:hAnsi="Courier New" w:hint="default"/>
+        <w:sz w:val="20"/>
+      </w:rPr>
+    </w:lvl>
+    <w:lvl w:ilvl="2" w:tentative="1">
+      <w:start w:val="1"/>
+      <w:numFmt w:val="bullet"/>
+      <w:lvlText w:val=""/>
+      <w:lvlJc w:val="left"/>
+      <w:pPr>
+        <w:tabs>
+          <w:tab w:val="num" w:pos="2160"/>
+        </w:tabs>
+        <w:ind w:left="2160" w:hanging="360"/>
+      </w:pPr>
+      <w:rPr>
+        <w:rFonts w:ascii="Wingdings" w:hAnsi="Wingdings" w:hint="default"/>
+        <w:sz w:val="20"/>
+      </w:rPr>
+    </w:lvl>
+    <w:lvl w:ilvl="3" w:tentative="1">
+      <w:start w:val="1"/>
+      <w:numFmt w:val="bullet"/>
+      <w:lvlText w:val=""/>
+      <w:lvlJc w:val="left"/>
+      <w:pPr>
+        <w:tabs>
+          <w:tab w:val="num" w:pos="2880"/>
+        </w:tabs>
+        <w:ind w:left="2880" w:hanging="360"/>
+      </w:pPr>
+      <w:rPr>
+        <w:rFonts w:ascii="Wingdings" w:hAnsi="Wingdings" w:hint="default"/>
+        <w:sz w:val="20"/>
+      </w:rPr>
+    </w:lvl>
+    <w:lvl w:ilvl="4" w:tentative="1">
+      <w:start w:val="1"/>
+      <w:numFmt w:val="bullet"/>
+      <w:lvlText w:val=""/>
+      <w:lvlJc w:val="left"/>
+      <w:pPr>
+        <w:tabs>
+          <w:tab w:val="num" w:pos="3600"/>
+        </w:tabs>
+        <w:ind w:left="3600" w:hanging="360"/>
+      </w:pPr>
+      <w:rPr>
+        <w:rFonts w:ascii="Wingdings" w:hAnsi="Wingdings" w:hint="default"/>
+        <w:sz w:val="20"/>
+      </w:rPr>
+    </w:lvl>
+    <w:lvl w:ilvl="5" w:tentative="1">
+      <w:start w:val="1"/>
+      <w:numFmt w:val="bullet"/>
+      <w:lvlText w:val=""/>
+      <w:lvlJc w:val="left"/>
+      <w:pPr>
+        <w:tabs>
+          <w:tab w:val="num" w:pos="4320"/>
+        </w:tabs>
+        <w:ind w:left="4320" w:hanging="360"/>
+      </w:pPr>
+      <w:rPr>
+        <w:rFonts w:ascii="Wingdings" w:hAnsi="Wingdings" w:hint="default"/>
+        <w:sz w:val="20"/>
+      </w:rPr>
+    </w:lvl>
+    <w:lvl w:ilvl="6" w:tentative="1">
+      <w:start w:val="1"/>
+      <w:numFmt w:val="bullet"/>
+      <w:lvlText w:val=""/>
+      <w:lvlJc w:val="left"/>
+      <w:pPr>
+        <w:tabs>
+          <w:tab w:val="num" w:pos="5040"/>
+        </w:tabs>
+        <w:ind w:left="5040" w:hanging="360"/>
+      </w:pPr>
+      <w:rPr>
+        <w:rFonts w:ascii="Wingdings" w:hAnsi="Wingdings" w:hint="default"/>
+        <w:sz w:val="20"/>
+      </w:rPr>
+    </w:lvl>
+    <w:lvl w:ilvl="7" w:tentative="1">
+      <w:start w:val="1"/>
+      <w:numFmt w:val="bullet"/>
+      <w:lvlText w:val=""/>
+      <w:lvlJc w:val="left"/>
+      <w:pPr>
+        <w:tabs>
+          <w:tab w:val="num" w:pos="5760"/>
+        </w:tabs>
+        <w:ind w:left="5760" w:hanging="360"/>
+      </w:pPr>
+      <w:rPr>
+        <w:rFonts w:ascii="Wingdings" w:hAnsi="Wingdings" w:hint="default"/>
+        <w:sz w:val="20"/>
+      </w:rPr>
+    </w:lvl>
+    <w:lvl w:ilvl="8" w:tentative="1">
+      <w:start w:val="1"/>
+      <w:numFmt w:val="bullet"/>
+      <w:lvlText w:val=""/>
+      <w:lvlJc w:val="left"/>
+      <w:pPr>
+        <w:tabs>
+          <w:tab w:val="num" w:pos="6480"/>
+        </w:tabs>
+        <w:ind w:left="6480" w:hanging="360"/>
+      </w:pPr>
+      <w:rPr>
+        <w:rFonts w:ascii="Wingdings" w:hAnsi="Wingdings" w:hint="default"/>
+        <w:sz w:val="20"/>
+      </w:rPr>
+    </w:lvl>
+  </w:abstractNum>
+  <w:abstractNum w:abstractNumId="38" w15:restartNumberingAfterBreak="0">
+    <w:nsid w:val="7F2870AF"/>
+    <w:multiLevelType w:val="multilevel"/>
+    <w:tmpl w:val="6B900592"/>
+    <w:lvl w:ilvl="0">
+      <w:start w:val="1"/>
+      <w:numFmt w:val="bullet"/>
+      <w:lvlText w:val=""/>
+      <w:lvlJc w:val="left"/>
+      <w:pPr>
+        <w:tabs>
+          <w:tab w:val="num" w:pos="720"/>
+        </w:tabs>
+        <w:ind w:left="720" w:hanging="360"/>
+      </w:pPr>
+      <w:rPr>
+        <w:rFonts w:ascii="Symbol" w:hAnsi="Symbol" w:hint="default"/>
+        <w:sz w:val="20"/>
+      </w:rPr>
+    </w:lvl>
+    <w:lvl w:ilvl="1" w:tentative="1">
+      <w:start w:val="1"/>
+      <w:numFmt w:val="bullet"/>
+      <w:lvlText w:val="o"/>
+      <w:lvlJc w:val="left"/>
+      <w:pPr>
+        <w:tabs>
+          <w:tab w:val="num" w:pos="1440"/>
+        </w:tabs>
+        <w:ind w:left="1440" w:hanging="360"/>
+      </w:pPr>
+      <w:rPr>
+        <w:rFonts w:ascii="Courier New" w:hAnsi="Courier New" w:hint="default"/>
+        <w:sz w:val="20"/>
+      </w:rPr>
+    </w:lvl>
+    <w:lvl w:ilvl="2" w:tentative="1">
+      <w:start w:val="1"/>
+      <w:numFmt w:val="bullet"/>
+      <w:lvlText w:val=""/>
+      <w:lvlJc w:val="left"/>
+      <w:pPr>
+        <w:tabs>
+          <w:tab w:val="num" w:pos="2160"/>
+        </w:tabs>
+        <w:ind w:left="2160" w:hanging="360"/>
+      </w:pPr>
+      <w:rPr>
+        <w:rFonts w:ascii="Wingdings" w:hAnsi="Wingdings" w:hint="default"/>
+        <w:sz w:val="20"/>
+      </w:rPr>
+    </w:lvl>
+    <w:lvl w:ilvl="3" w:tentative="1">
+      <w:start w:val="1"/>
+      <w:numFmt w:val="bullet"/>
+      <w:lvlText w:val=""/>
+      <w:lvlJc w:val="left"/>
+      <w:pPr>
+        <w:tabs>
+          <w:tab w:val="num" w:pos="2880"/>
+        </w:tabs>
+        <w:ind w:left="2880" w:hanging="360"/>
+      </w:pPr>
+      <w:rPr>
+        <w:rFonts w:ascii="Wingdings" w:hAnsi="Wingdings" w:hint="default"/>
+        <w:sz w:val="20"/>
+      </w:rPr>
+    </w:lvl>
+    <w:lvl w:ilvl="4" w:tentative="1">
+      <w:start w:val="1"/>
+      <w:numFmt w:val="bullet"/>
+      <w:lvlText w:val=""/>
+      <w:lvlJc w:val="left"/>
+      <w:pPr>
+        <w:tabs>
+          <w:tab w:val="num" w:pos="3600"/>
+        </w:tabs>
+        <w:ind w:left="3600" w:hanging="360"/>
+      </w:pPr>
+      <w:rPr>
+        <w:rFonts w:ascii="Wingdings" w:hAnsi="Wingdings" w:hint="default"/>
+        <w:sz w:val="20"/>
+      </w:rPr>
+    </w:lvl>
+    <w:lvl w:ilvl="5" w:tentative="1">
+      <w:start w:val="1"/>
+      <w:numFmt w:val="bullet"/>
+      <w:lvlText w:val=""/>
+      <w:lvlJc w:val="left"/>
+      <w:pPr>
+        <w:tabs>
+          <w:tab w:val="num" w:pos="4320"/>
+        </w:tabs>
+        <w:ind w:left="4320" w:hanging="360"/>
+      </w:pPr>
+      <w:rPr>
+        <w:rFonts w:ascii="Wingdings" w:hAnsi="Wingdings" w:hint="default"/>
+        <w:sz w:val="20"/>
+      </w:rPr>
+    </w:lvl>
+    <w:lvl w:ilvl="6" w:tentative="1">
+      <w:start w:val="1"/>
+      <w:numFmt w:val="bullet"/>
+      <w:lvlText w:val=""/>
+      <w:lvlJc w:val="left"/>
+      <w:pPr>
+        <w:tabs>
+          <w:tab w:val="num" w:pos="5040"/>
+        </w:tabs>
+        <w:ind w:left="5040" w:hanging="360"/>
+      </w:pPr>
+      <w:rPr>
+        <w:rFonts w:ascii="Wingdings" w:hAnsi="Wingdings" w:hint="default"/>
+        <w:sz w:val="20"/>
+      </w:rPr>
+    </w:lvl>
+    <w:lvl w:ilvl="7" w:tentative="1">
+      <w:start w:val="1"/>
+      <w:numFmt w:val="bullet"/>
+      <w:lvlText w:val=""/>
+      <w:lvlJc w:val="left"/>
+      <w:pPr>
+        <w:tabs>
+          <w:tab w:val="num" w:pos="5760"/>
+        </w:tabs>
+        <w:ind w:left="5760" w:hanging="360"/>
+      </w:pPr>
+      <w:rPr>
+        <w:rFonts w:ascii="Wingdings" w:hAnsi="Wingdings" w:hint="default"/>
+        <w:sz w:val="20"/>
+      </w:rPr>
+    </w:lvl>
+    <w:lvl w:ilvl="8" w:tentative="1">
+      <w:start w:val="1"/>
+      <w:numFmt w:val="bullet"/>
+      <w:lvlText w:val=""/>
+      <w:lvlJc w:val="left"/>
+      <w:pPr>
+        <w:tabs>
+          <w:tab w:val="num" w:pos="6480"/>
+        </w:tabs>
+        <w:ind w:left="6480" w:hanging="360"/>
+      </w:pPr>
+      <w:rPr>
+        <w:rFonts w:ascii="Wingdings" w:hAnsi="Wingdings" w:hint="default"/>
+        <w:sz w:val="20"/>
+      </w:rPr>
+    </w:lvl>
+  </w:abstractNum>
+  <w:abstractNum w:abstractNumId="39" w15:restartNumberingAfterBreak="0">
     <w:nsid w:val="7FCC7FCC"/>
     <w:multiLevelType w:val="multilevel"/>
     <w:tmpl w:val="FF2834FC"/>
@@ -15693,94 +20083,124 @@
     </w:lvl>
   </w:abstractNum>
   <w:num w:numId="1" w16cid:durableId="293099148">
+    <w:abstractNumId w:val="34"/>
+  </w:num>
+  <w:num w:numId="2" w16cid:durableId="1002926807">
+    <w:abstractNumId w:val="30"/>
+  </w:num>
+  <w:num w:numId="3" w16cid:durableId="2031102750">
+    <w:abstractNumId w:val="19"/>
+  </w:num>
+  <w:num w:numId="4" w16cid:durableId="1900751175">
+    <w:abstractNumId w:val="22"/>
+  </w:num>
+  <w:num w:numId="5" w16cid:durableId="161747880">
+    <w:abstractNumId w:val="12"/>
+  </w:num>
+  <w:num w:numId="6" w16cid:durableId="71129249">
+    <w:abstractNumId w:val="26"/>
+  </w:num>
+  <w:num w:numId="7" w16cid:durableId="1127163051">
+    <w:abstractNumId w:val="29"/>
+  </w:num>
+  <w:num w:numId="8" w16cid:durableId="1031228246">
+    <w:abstractNumId w:val="35"/>
+  </w:num>
+  <w:num w:numId="9" w16cid:durableId="581840087">
+    <w:abstractNumId w:val="17"/>
+  </w:num>
+  <w:num w:numId="10" w16cid:durableId="1087462254">
+    <w:abstractNumId w:val="5"/>
+  </w:num>
+  <w:num w:numId="11" w16cid:durableId="2120561530">
+    <w:abstractNumId w:val="39"/>
+  </w:num>
+  <w:num w:numId="12" w16cid:durableId="821775796">
+    <w:abstractNumId w:val="8"/>
+  </w:num>
+  <w:num w:numId="13" w16cid:durableId="2047565134">
+    <w:abstractNumId w:val="18"/>
+  </w:num>
+  <w:num w:numId="14" w16cid:durableId="417412835">
+    <w:abstractNumId w:val="21"/>
+  </w:num>
+  <w:num w:numId="15" w16cid:durableId="1958678635">
     <w:abstractNumId w:val="27"/>
   </w:num>
-  <w:num w:numId="2" w16cid:durableId="1002926807">
+  <w:num w:numId="16" w16cid:durableId="1056273667">
+    <w:abstractNumId w:val="6"/>
+  </w:num>
+  <w:num w:numId="17" w16cid:durableId="285359964">
+    <w:abstractNumId w:val="9"/>
+  </w:num>
+  <w:num w:numId="18" w16cid:durableId="1859199503">
+    <w:abstractNumId w:val="25"/>
+  </w:num>
+  <w:num w:numId="19" w16cid:durableId="2031567017">
+    <w:abstractNumId w:val="4"/>
+  </w:num>
+  <w:num w:numId="20" w16cid:durableId="1720395171">
+    <w:abstractNumId w:val="32"/>
+  </w:num>
+  <w:num w:numId="21" w16cid:durableId="1075708925">
+    <w:abstractNumId w:val="20"/>
+  </w:num>
+  <w:num w:numId="22" w16cid:durableId="846792876">
+    <w:abstractNumId w:val="33"/>
+  </w:num>
+  <w:num w:numId="23" w16cid:durableId="1328900824">
+    <w:abstractNumId w:val="2"/>
+  </w:num>
+  <w:num w:numId="24" w16cid:durableId="1922137883">
+    <w:abstractNumId w:val="28"/>
+  </w:num>
+  <w:num w:numId="25" w16cid:durableId="1718234284">
+    <w:abstractNumId w:val="15"/>
+  </w:num>
+  <w:num w:numId="26" w16cid:durableId="1746687022">
+    <w:abstractNumId w:val="13"/>
+  </w:num>
+  <w:num w:numId="27" w16cid:durableId="56897630">
+    <w:abstractNumId w:val="10"/>
+  </w:num>
+  <w:num w:numId="28" w16cid:durableId="1218664069">
     <w:abstractNumId w:val="24"/>
   </w:num>
-  <w:num w:numId="3" w16cid:durableId="2031102750">
+  <w:num w:numId="29" w16cid:durableId="818885725">
     <w:abstractNumId w:val="14"/>
   </w:num>
-  <w:num w:numId="4" w16cid:durableId="1900751175">
-    <w:abstractNumId w:val="17"/>
+  <w:num w:numId="30" w16cid:durableId="695732270">
+    <w:abstractNumId w:val="1"/>
   </w:num>
-  <w:num w:numId="5" w16cid:durableId="161747880">
-    <w:abstractNumId w:val="8"/>
+  <w:num w:numId="31" w16cid:durableId="1826777632">
+    <w:abstractNumId w:val="16"/>
   </w:num>
-  <w:num w:numId="6" w16cid:durableId="71129249">
-    <w:abstractNumId w:val="20"/>
+  <w:num w:numId="32" w16cid:durableId="1785417088">
+    <w:abstractNumId w:val="3"/>
   </w:num>
-  <w:num w:numId="7" w16cid:durableId="1127163051">
+  <w:num w:numId="33" w16cid:durableId="1416512839">
+    <w:abstractNumId w:val="36"/>
+  </w:num>
+  <w:num w:numId="34" w16cid:durableId="195655047">
+    <w:abstractNumId w:val="38"/>
+  </w:num>
+  <w:num w:numId="35" w16cid:durableId="663629610">
+    <w:abstractNumId w:val="0"/>
+  </w:num>
+  <w:num w:numId="36" w16cid:durableId="835654946">
+    <w:abstractNumId w:val="7"/>
+  </w:num>
+  <w:num w:numId="37" w16cid:durableId="1235123938">
     <w:abstractNumId w:val="23"/>
   </w:num>
-  <w:num w:numId="8" w16cid:durableId="1031228246">
-    <w:abstractNumId w:val="28"/>
+  <w:num w:numId="38" w16cid:durableId="437798087">
+    <w:abstractNumId w:val="31"/>
   </w:num>
-  <w:num w:numId="9" w16cid:durableId="581840087">
-    <w:abstractNumId w:val="12"/>
-  </w:num>
-  <w:num w:numId="10" w16cid:durableId="1087462254">
-    <w:abstractNumId w:val="3"/>
-  </w:num>
-  <w:num w:numId="11" w16cid:durableId="2120561530">
-    <w:abstractNumId w:val="29"/>
-  </w:num>
-  <w:num w:numId="12" w16cid:durableId="821775796">
-    <w:abstractNumId w:val="5"/>
-  </w:num>
-  <w:num w:numId="13" w16cid:durableId="2047565134">
-    <w:abstractNumId w:val="13"/>
-  </w:num>
-  <w:num w:numId="14" w16cid:durableId="417412835">
-    <w:abstractNumId w:val="16"/>
-  </w:num>
-  <w:num w:numId="15" w16cid:durableId="1958678635">
-    <w:abstractNumId w:val="21"/>
-  </w:num>
-  <w:num w:numId="16" w16cid:durableId="1056273667">
-    <w:abstractNumId w:val="4"/>
-  </w:num>
-  <w:num w:numId="17" w16cid:durableId="285359964">
-    <w:abstractNumId w:val="6"/>
-  </w:num>
-  <w:num w:numId="18" w16cid:durableId="1859199503">
-    <w:abstractNumId w:val="19"/>
-  </w:num>
-  <w:num w:numId="19" w16cid:durableId="2031567017">
-    <w:abstractNumId w:val="2"/>
-  </w:num>
-  <w:num w:numId="20" w16cid:durableId="1720395171">
-    <w:abstractNumId w:val="25"/>
-  </w:num>
-  <w:num w:numId="21" w16cid:durableId="1075708925">
-    <w:abstractNumId w:val="15"/>
-  </w:num>
-  <w:num w:numId="22" w16cid:durableId="846792876">
-    <w:abstractNumId w:val="26"/>
-  </w:num>
-  <w:num w:numId="23" w16cid:durableId="1328900824">
-    <w:abstractNumId w:val="1"/>
-  </w:num>
-  <w:num w:numId="24" w16cid:durableId="1922137883">
-    <w:abstractNumId w:val="22"/>
-  </w:num>
-  <w:num w:numId="25" w16cid:durableId="1718234284">
+  <w:num w:numId="39" w16cid:durableId="1409228938">
     <w:abstractNumId w:val="11"/>
   </w:num>
-  <w:num w:numId="26" w16cid:durableId="1746687022">
-    <w:abstractNumId w:val="9"/>
-  </w:num>
-  <w:num w:numId="27" w16cid:durableId="56897630">
-    <w:abstractNumId w:val="7"/>
-  </w:num>
-  <w:num w:numId="28" w16cid:durableId="1218664069">
-    <w:abstractNumId w:val="18"/>
-  </w:num>
-  <w:num w:numId="29" w16cid:durableId="818885725">
-    <w:abstractNumId w:val="10"/>
-  </w:num>
-  <w:num w:numId="30" w16cid:durableId="695732270">
-    <w:abstractNumId w:val="0"/>
+  <w:num w:numId="40" w16cid:durableId="1406414928">
+    <w:abstractNumId w:val="37"/>
   </w:num>
 </w:numbering>
 </file>
@@ -16388,7 +20808,6 @@
   <w:style w:type="character" w:default="1" w:styleId="DefaultParagraphFont">
     <w:name w:val="Default Paragraph Font"/>
     <w:uiPriority w:val="1"/>
-    <w:semiHidden/>
     <w:unhideWhenUsed/>
   </w:style>
   <w:style w:type="table" w:default="1" w:styleId="TableNormal">

</xml_diff>